<commit_message>
[v5.70.16] docs(architecture): expand Docker deployment design
</commit_message>
<xml_diff>
--- a/outputs/all-systems-hld/聚信多系统业务平台高层设计.docx
+++ b/outputs/all-systems-hld/聚信多系统业务平台高层设计.docx
@@ -85,7 +85,7 @@
           <w:color w:val="263646"/>
           <w:sz w:val="23"/>
         </w:rPr>
-        <w:t>适用版本：5.70.15 及后续兼容版本</w:t>
+        <w:t>适用版本：5.70.16 及后续兼容版本</w:t>
       </w:r>
     </w:p>
     <w:p>
@@ -7958,7 +7958,7 @@
           <w:color w:val="263646"/>
           <w:sz w:val="21"/>
         </w:rPr>
-        <w:t xml:space="preserve">根 </w:t>
+        <w:t xml:space="preserve">当前部署基线是仓库根目录 </w:t>
       </w:r>
       <w:r>
         <w:rPr>
@@ -7974,7 +7974,17 @@
           <w:color w:val="263646"/>
           <w:sz w:val="21"/>
         </w:rPr>
-        <w:t xml:space="preserve"> 编排：</w:t>
+        <w:t>。它不是补充脚本，而是本地、测试和中小规模交付环境的主运行拓扑。</w:t>
+      </w:r>
+    </w:p>
+    <w:p>
+      <w:r>
+        <w:rPr>
+          <w:rFonts w:ascii="STHeiti" w:hAnsi="STHeiti" w:eastAsia="STHeiti"/>
+          <w:color w:val="263646"/>
+          <w:sz w:val="21"/>
+        </w:rPr>
+        <w:t>根 Compose 编排：</w:t>
       </w:r>
     </w:p>
     <w:p>
@@ -8090,7 +8100,709 @@
         <w:pStyle w:val="Heading3"/>
       </w:pPr>
       <w:r>
-        <w:t>9.2 配置与密钥</w:t>
+        <w:t>9.2 Docker Compose 分层</w:t>
+      </w:r>
+    </w:p>
+    <w:p>
+      <w:r>
+        <w:rPr>
+          <w:rFonts w:ascii="STHeiti" w:hAnsi="STHeiti" w:eastAsia="STHeiti"/>
+          <w:color w:val="263646"/>
+          <w:sz w:val="21"/>
+        </w:rPr>
+        <w:t>当前 Compose 可按五层理解：</w:t>
+      </w:r>
+    </w:p>
+    <w:tbl>
+      <w:tblPr>
+        <w:tblStyle w:val="TableGrid"/>
+        <w:tblW w:type="auto" w:w="0"/>
+        <w:jc w:val="center"/>
+        <w:tblLayout w:type="autofit"/>
+        <w:tblLook w:firstColumn="1" w:firstRow="1" w:lastColumn="0" w:lastRow="0" w:noHBand="0" w:noVBand="1" w:val="04A0"/>
+      </w:tblPr>
+      <w:tblGrid>
+        <w:gridCol w:w="3099"/>
+        <w:gridCol w:w="3099"/>
+        <w:gridCol w:w="3099"/>
+      </w:tblGrid>
+      <w:tr>
+        <w:trPr>
+          <w:tblHeader w:val="true"/>
+        </w:trPr>
+        <w:tc>
+          <w:tcPr>
+            <w:tcW w:type="dxa" w:w="3099"/>
+            <w:vAlign w:val="center"/>
+            <w:shd w:fill="12365A"/>
+          </w:tcPr>
+          <w:p>
+            <w:r>
+              <w:rPr>
+                <w:rFonts w:ascii="STHeiti" w:hAnsi="STHeiti" w:eastAsia="STHeiti"/>
+                <w:b/>
+                <w:color w:val="FFFFFF"/>
+                <w:sz w:val="18"/>
+              </w:rPr>
+              <w:t>层级</w:t>
+            </w:r>
+          </w:p>
+        </w:tc>
+        <w:tc>
+          <w:tcPr>
+            <w:tcW w:type="dxa" w:w="3099"/>
+            <w:vAlign w:val="center"/>
+            <w:shd w:fill="12365A"/>
+          </w:tcPr>
+          <w:p>
+            <w:r>
+              <w:rPr>
+                <w:rFonts w:ascii="STHeiti" w:hAnsi="STHeiti" w:eastAsia="STHeiti"/>
+                <w:b/>
+                <w:color w:val="FFFFFF"/>
+                <w:sz w:val="18"/>
+              </w:rPr>
+              <w:t>Compose 服务</w:t>
+            </w:r>
+          </w:p>
+        </w:tc>
+        <w:tc>
+          <w:tcPr>
+            <w:tcW w:type="dxa" w:w="3099"/>
+            <w:vAlign w:val="center"/>
+            <w:shd w:fill="12365A"/>
+          </w:tcPr>
+          <w:p>
+            <w:r>
+              <w:rPr>
+                <w:rFonts w:ascii="STHeiti" w:hAnsi="STHeiti" w:eastAsia="STHeiti"/>
+                <w:b/>
+                <w:color w:val="FFFFFF"/>
+                <w:sz w:val="18"/>
+              </w:rPr>
+              <w:t>作用</w:t>
+            </w:r>
+          </w:p>
+        </w:tc>
+      </w:tr>
+      <w:tr>
+        <w:tc>
+          <w:tcPr>
+            <w:tcW w:type="dxa" w:w="3099"/>
+            <w:vAlign w:val="center"/>
+          </w:tcPr>
+          <w:p>
+            <w:r>
+              <w:rPr>
+                <w:rFonts w:ascii="STHeiti" w:hAnsi="STHeiti" w:eastAsia="STHeiti"/>
+                <w:color w:val="263646"/>
+                <w:sz w:val="18"/>
+              </w:rPr>
+              <w:t>接入层</w:t>
+            </w:r>
+          </w:p>
+        </w:tc>
+        <w:tc>
+          <w:tcPr>
+            <w:tcW w:type="dxa" w:w="3099"/>
+            <w:vAlign w:val="center"/>
+          </w:tcPr>
+          <w:p>
+            <w:r>
+              <w:rPr>
+                <w:rFonts w:ascii="Courier New" w:hAnsi="Courier New" w:eastAsia="Courier New"/>
+                <w:color w:val="12365A"/>
+                <w:sz w:val="17"/>
+              </w:rPr>
+              <w:t>auth</w:t>
+            </w:r>
+            <w:r>
+              <w:rPr>
+                <w:rFonts w:ascii="STHeiti" w:hAnsi="STHeiti" w:eastAsia="STHeiti"/>
+                <w:color w:val="263646"/>
+                <w:sz w:val="18"/>
+              </w:rPr>
+              <w:t xml:space="preserve">、各 </w:t>
+            </w:r>
+            <w:r>
+              <w:rPr>
+                <w:rFonts w:ascii="Courier New" w:hAnsi="Courier New" w:eastAsia="Courier New"/>
+                <w:color w:val="12365A"/>
+                <w:sz w:val="17"/>
+              </w:rPr>
+              <w:t>web-*</w:t>
+            </w:r>
+            <w:r>
+              <w:rPr>
+                <w:rFonts w:ascii="STHeiti" w:hAnsi="STHeiti" w:eastAsia="STHeiti"/>
+                <w:color w:val="263646"/>
+                <w:sz w:val="18"/>
+              </w:rPr>
+              <w:t>、</w:t>
+            </w:r>
+            <w:r>
+              <w:rPr>
+                <w:rFonts w:ascii="Courier New" w:hAnsi="Courier New" w:eastAsia="Courier New"/>
+                <w:color w:val="12365A"/>
+                <w:sz w:val="17"/>
+              </w:rPr>
+              <w:t>web</w:t>
+            </w:r>
+            <w:r>
+              <w:rPr>
+                <w:rFonts w:ascii="STHeiti" w:hAnsi="STHeiti" w:eastAsia="STHeiti"/>
+                <w:color w:val="263646"/>
+                <w:sz w:val="18"/>
+              </w:rPr>
+              <w:t>、</w:t>
+            </w:r>
+            <w:r>
+              <w:rPr>
+                <w:rFonts w:ascii="Courier New" w:hAnsi="Courier New" w:eastAsia="Courier New"/>
+                <w:color w:val="12365A"/>
+                <w:sz w:val="17"/>
+              </w:rPr>
+              <w:t>web-cmdb</w:t>
+            </w:r>
+          </w:p>
+        </w:tc>
+        <w:tc>
+          <w:tcPr>
+            <w:tcW w:type="dxa" w:w="3099"/>
+            <w:vAlign w:val="center"/>
+          </w:tcPr>
+          <w:p>
+            <w:r>
+              <w:rPr>
+                <w:rFonts w:ascii="STHeiti" w:hAnsi="STHeiti" w:eastAsia="STHeiti"/>
+                <w:color w:val="263646"/>
+                <w:sz w:val="18"/>
+              </w:rPr>
+              <w:t>提供统一门户、专用中心和各系统前端静态站点</w:t>
+            </w:r>
+          </w:p>
+        </w:tc>
+      </w:tr>
+      <w:tr>
+        <w:tc>
+          <w:tcPr>
+            <w:tcW w:type="dxa" w:w="3099"/>
+            <w:vAlign w:val="center"/>
+            <w:shd w:fill="F4F7FA"/>
+          </w:tcPr>
+          <w:p>
+            <w:r>
+              <w:rPr>
+                <w:rFonts w:ascii="STHeiti" w:hAnsi="STHeiti" w:eastAsia="STHeiti"/>
+                <w:color w:val="263646"/>
+                <w:sz w:val="18"/>
+              </w:rPr>
+              <w:t>业务 API 层</w:t>
+            </w:r>
+          </w:p>
+        </w:tc>
+        <w:tc>
+          <w:tcPr>
+            <w:tcW w:type="dxa" w:w="3099"/>
+            <w:vAlign w:val="center"/>
+            <w:shd w:fill="F4F7FA"/>
+          </w:tcPr>
+          <w:p>
+            <w:r>
+              <w:rPr>
+                <w:rFonts w:ascii="Courier New" w:hAnsi="Courier New" w:eastAsia="Courier New"/>
+                <w:color w:val="12365A"/>
+                <w:sz w:val="17"/>
+              </w:rPr>
+              <w:t>api</w:t>
+            </w:r>
+            <w:r>
+              <w:rPr>
+                <w:rFonts w:ascii="STHeiti" w:hAnsi="STHeiti" w:eastAsia="STHeiti"/>
+                <w:color w:val="263646"/>
+                <w:sz w:val="18"/>
+              </w:rPr>
+              <w:t>、</w:t>
+            </w:r>
+            <w:r>
+              <w:rPr>
+                <w:rFonts w:ascii="Courier New" w:hAnsi="Courier New" w:eastAsia="Courier New"/>
+                <w:color w:val="12365A"/>
+                <w:sz w:val="17"/>
+              </w:rPr>
+              <w:t>delivery-api</w:t>
+            </w:r>
+            <w:r>
+              <w:rPr>
+                <w:rFonts w:ascii="STHeiti" w:hAnsi="STHeiti" w:eastAsia="STHeiti"/>
+                <w:color w:val="263646"/>
+                <w:sz w:val="18"/>
+              </w:rPr>
+              <w:t>、</w:t>
+            </w:r>
+            <w:r>
+              <w:rPr>
+                <w:rFonts w:ascii="Courier New" w:hAnsi="Courier New" w:eastAsia="Courier New"/>
+                <w:color w:val="12365A"/>
+                <w:sz w:val="17"/>
+              </w:rPr>
+              <w:t>inventory-api</w:t>
+            </w:r>
+            <w:r>
+              <w:rPr>
+                <w:rFonts w:ascii="STHeiti" w:hAnsi="STHeiti" w:eastAsia="STHeiti"/>
+                <w:color w:val="263646"/>
+                <w:sz w:val="18"/>
+              </w:rPr>
+              <w:t>、</w:t>
+            </w:r>
+            <w:r>
+              <w:rPr>
+                <w:rFonts w:ascii="Courier New" w:hAnsi="Courier New" w:eastAsia="Courier New"/>
+                <w:color w:val="12365A"/>
+                <w:sz w:val="17"/>
+              </w:rPr>
+              <w:t>device-flow-api</w:t>
+            </w:r>
+            <w:r>
+              <w:rPr>
+                <w:rFonts w:ascii="STHeiti" w:hAnsi="STHeiti" w:eastAsia="STHeiti"/>
+                <w:color w:val="263646"/>
+                <w:sz w:val="18"/>
+              </w:rPr>
+              <w:t>、</w:t>
+            </w:r>
+            <w:r>
+              <w:rPr>
+                <w:rFonts w:ascii="Courier New" w:hAnsi="Courier New" w:eastAsia="Courier New"/>
+                <w:color w:val="12365A"/>
+                <w:sz w:val="17"/>
+              </w:rPr>
+              <w:t>faq-api</w:t>
+            </w:r>
+            <w:r>
+              <w:rPr>
+                <w:rFonts w:ascii="STHeiti" w:hAnsi="STHeiti" w:eastAsia="STHeiti"/>
+                <w:color w:val="263646"/>
+                <w:sz w:val="18"/>
+              </w:rPr>
+              <w:t>、</w:t>
+            </w:r>
+            <w:r>
+              <w:rPr>
+                <w:rFonts w:ascii="Courier New" w:hAnsi="Courier New" w:eastAsia="Courier New"/>
+                <w:color w:val="12365A"/>
+                <w:sz w:val="17"/>
+              </w:rPr>
+              <w:t>tender-api</w:t>
+            </w:r>
+            <w:r>
+              <w:rPr>
+                <w:rFonts w:ascii="STHeiti" w:hAnsi="STHeiti" w:eastAsia="STHeiti"/>
+                <w:color w:val="263646"/>
+                <w:sz w:val="18"/>
+              </w:rPr>
+              <w:t>、</w:t>
+            </w:r>
+            <w:r>
+              <w:rPr>
+                <w:rFonts w:ascii="Courier New" w:hAnsi="Courier New" w:eastAsia="Courier New"/>
+                <w:color w:val="12365A"/>
+                <w:sz w:val="17"/>
+              </w:rPr>
+              <w:t>train-exam-api</w:t>
+            </w:r>
+            <w:r>
+              <w:rPr>
+                <w:rFonts w:ascii="STHeiti" w:hAnsi="STHeiti" w:eastAsia="STHeiti"/>
+                <w:color w:val="263646"/>
+                <w:sz w:val="18"/>
+              </w:rPr>
+              <w:t>、</w:t>
+            </w:r>
+            <w:r>
+              <w:rPr>
+                <w:rFonts w:ascii="Courier New" w:hAnsi="Courier New" w:eastAsia="Courier New"/>
+                <w:color w:val="12365A"/>
+                <w:sz w:val="17"/>
+              </w:rPr>
+              <w:t>prompt-center-api</w:t>
+            </w:r>
+            <w:r>
+              <w:rPr>
+                <w:rFonts w:ascii="STHeiti" w:hAnsi="STHeiti" w:eastAsia="STHeiti"/>
+                <w:color w:val="263646"/>
+                <w:sz w:val="18"/>
+              </w:rPr>
+              <w:t>、</w:t>
+            </w:r>
+            <w:r>
+              <w:rPr>
+                <w:rFonts w:ascii="Courier New" w:hAnsi="Courier New" w:eastAsia="Courier New"/>
+                <w:color w:val="12365A"/>
+                <w:sz w:val="17"/>
+              </w:rPr>
+              <w:t>sca-api</w:t>
+            </w:r>
+            <w:r>
+              <w:rPr>
+                <w:rFonts w:ascii="STHeiti" w:hAnsi="STHeiti" w:eastAsia="STHeiti"/>
+                <w:color w:val="263646"/>
+                <w:sz w:val="18"/>
+              </w:rPr>
+              <w:t>、</w:t>
+            </w:r>
+            <w:r>
+              <w:rPr>
+                <w:rFonts w:ascii="Courier New" w:hAnsi="Courier New" w:eastAsia="Courier New"/>
+                <w:color w:val="12365A"/>
+                <w:sz w:val="17"/>
+              </w:rPr>
+              <w:t>big-screen-api</w:t>
+            </w:r>
+            <w:r>
+              <w:rPr>
+                <w:rFonts w:ascii="STHeiti" w:hAnsi="STHeiti" w:eastAsia="STHeiti"/>
+                <w:color w:val="263646"/>
+                <w:sz w:val="18"/>
+              </w:rPr>
+              <w:t>、</w:t>
+            </w:r>
+            <w:r>
+              <w:rPr>
+                <w:rFonts w:ascii="Courier New" w:hAnsi="Courier New" w:eastAsia="Courier New"/>
+                <w:color w:val="12365A"/>
+                <w:sz w:val="17"/>
+              </w:rPr>
+              <w:t>cmdb</w:t>
+            </w:r>
+          </w:p>
+        </w:tc>
+        <w:tc>
+          <w:tcPr>
+            <w:tcW w:type="dxa" w:w="3099"/>
+            <w:vAlign w:val="center"/>
+            <w:shd w:fill="F4F7FA"/>
+          </w:tcPr>
+          <w:p>
+            <w:r>
+              <w:rPr>
+                <w:rFonts w:ascii="STHeiti" w:hAnsi="STHeiti" w:eastAsia="STHeiti"/>
+                <w:color w:val="263646"/>
+                <w:sz w:val="18"/>
+              </w:rPr>
+              <w:t>承载业务接口、鉴权、审计和领域逻辑</w:t>
+            </w:r>
+          </w:p>
+        </w:tc>
+      </w:tr>
+      <w:tr>
+        <w:tc>
+          <w:tcPr>
+            <w:tcW w:type="dxa" w:w="3099"/>
+            <w:vAlign w:val="center"/>
+          </w:tcPr>
+          <w:p>
+            <w:r>
+              <w:rPr>
+                <w:rFonts w:ascii="STHeiti" w:hAnsi="STHeiti" w:eastAsia="STHeiti"/>
+                <w:color w:val="263646"/>
+                <w:sz w:val="18"/>
+              </w:rPr>
+              <w:t>异步任务层</w:t>
+            </w:r>
+          </w:p>
+        </w:tc>
+        <w:tc>
+          <w:tcPr>
+            <w:tcW w:type="dxa" w:w="3099"/>
+            <w:vAlign w:val="center"/>
+          </w:tcPr>
+          <w:p>
+            <w:r>
+              <w:rPr>
+                <w:rFonts w:ascii="Courier New" w:hAnsi="Courier New" w:eastAsia="Courier New"/>
+                <w:color w:val="12365A"/>
+                <w:sz w:val="17"/>
+              </w:rPr>
+              <w:t>sca-worker</w:t>
+            </w:r>
+            <w:r>
+              <w:rPr>
+                <w:rFonts w:ascii="STHeiti" w:hAnsi="STHeiti" w:eastAsia="STHeiti"/>
+                <w:color w:val="263646"/>
+                <w:sz w:val="18"/>
+              </w:rPr>
+              <w:t>、</w:t>
+            </w:r>
+            <w:r>
+              <w:rPr>
+                <w:rFonts w:ascii="Courier New" w:hAnsi="Courier New" w:eastAsia="Courier New"/>
+                <w:color w:val="12365A"/>
+                <w:sz w:val="17"/>
+              </w:rPr>
+              <w:t>sca-scanner-worker</w:t>
+            </w:r>
+            <w:r>
+              <w:rPr>
+                <w:rFonts w:ascii="STHeiti" w:hAnsi="STHeiti" w:eastAsia="STHeiti"/>
+                <w:color w:val="263646"/>
+                <w:sz w:val="18"/>
+              </w:rPr>
+              <w:t>、</w:t>
+            </w:r>
+            <w:r>
+              <w:rPr>
+                <w:rFonts w:ascii="Courier New" w:hAnsi="Courier New" w:eastAsia="Courier New"/>
+                <w:color w:val="12365A"/>
+                <w:sz w:val="17"/>
+              </w:rPr>
+              <w:t>sca-beat</w:t>
+            </w:r>
+          </w:p>
+        </w:tc>
+        <w:tc>
+          <w:tcPr>
+            <w:tcW w:type="dxa" w:w="3099"/>
+            <w:vAlign w:val="center"/>
+          </w:tcPr>
+          <w:p>
+            <w:r>
+              <w:rPr>
+                <w:rFonts w:ascii="STHeiti" w:hAnsi="STHeiti" w:eastAsia="STHeiti"/>
+                <w:color w:val="263646"/>
+                <w:sz w:val="18"/>
+              </w:rPr>
+              <w:t>执行 SCA 长耗时扫描、持续风险监测和定时任务</w:t>
+            </w:r>
+          </w:p>
+        </w:tc>
+      </w:tr>
+      <w:tr>
+        <w:tc>
+          <w:tcPr>
+            <w:tcW w:type="dxa" w:w="3099"/>
+            <w:vAlign w:val="center"/>
+            <w:shd w:fill="F4F7FA"/>
+          </w:tcPr>
+          <w:p>
+            <w:r>
+              <w:rPr>
+                <w:rFonts w:ascii="STHeiti" w:hAnsi="STHeiti" w:eastAsia="STHeiti"/>
+                <w:color w:val="263646"/>
+                <w:sz w:val="18"/>
+              </w:rPr>
+              <w:t>集成服务层</w:t>
+            </w:r>
+          </w:p>
+        </w:tc>
+        <w:tc>
+          <w:tcPr>
+            <w:tcW w:type="dxa" w:w="3099"/>
+            <w:vAlign w:val="center"/>
+            <w:shd w:fill="F4F7FA"/>
+          </w:tcPr>
+          <w:p>
+            <w:r>
+              <w:rPr>
+                <w:rFonts w:ascii="Courier New" w:hAnsi="Courier New" w:eastAsia="Courier New"/>
+                <w:color w:val="12365A"/>
+                <w:sz w:val="17"/>
+              </w:rPr>
+              <w:t>shipping-gateway</w:t>
+            </w:r>
+            <w:r>
+              <w:rPr>
+                <w:rFonts w:ascii="STHeiti" w:hAnsi="STHeiti" w:eastAsia="STHeiti"/>
+                <w:color w:val="263646"/>
+                <w:sz w:val="18"/>
+              </w:rPr>
+              <w:t>、</w:t>
+            </w:r>
+            <w:r>
+              <w:rPr>
+                <w:rFonts w:ascii="Courier New" w:hAnsi="Courier New" w:eastAsia="Courier New"/>
+                <w:color w:val="12365A"/>
+                <w:sz w:val="17"/>
+              </w:rPr>
+              <w:t>onlyoffice</w:t>
+            </w:r>
+            <w:r>
+              <w:rPr>
+                <w:rFonts w:ascii="STHeiti" w:hAnsi="STHeiti" w:eastAsia="STHeiti"/>
+                <w:color w:val="263646"/>
+                <w:sz w:val="18"/>
+              </w:rPr>
+              <w:t>、</w:t>
+            </w:r>
+            <w:r>
+              <w:rPr>
+                <w:rFonts w:ascii="Courier New" w:hAnsi="Courier New" w:eastAsia="Courier New"/>
+                <w:color w:val="12365A"/>
+                <w:sz w:val="17"/>
+              </w:rPr>
+              <w:t>train-exam-onlyoffice</w:t>
+            </w:r>
+            <w:r>
+              <w:rPr>
+                <w:rFonts w:ascii="STHeiti" w:hAnsi="STHeiti" w:eastAsia="STHeiti"/>
+                <w:color w:val="263646"/>
+                <w:sz w:val="18"/>
+              </w:rPr>
+              <w:t>、</w:t>
+            </w:r>
+            <w:r>
+              <w:rPr>
+                <w:rFonts w:ascii="Courier New" w:hAnsi="Courier New" w:eastAsia="Courier New"/>
+                <w:color w:val="12365A"/>
+                <w:sz w:val="17"/>
+              </w:rPr>
+              <w:t>dependency-track-apiserver</w:t>
+            </w:r>
+            <w:r>
+              <w:rPr>
+                <w:rFonts w:ascii="STHeiti" w:hAnsi="STHeiti" w:eastAsia="STHeiti"/>
+                <w:color w:val="263646"/>
+                <w:sz w:val="18"/>
+              </w:rPr>
+              <w:t>、</w:t>
+            </w:r>
+            <w:r>
+              <w:rPr>
+                <w:rFonts w:ascii="Courier New" w:hAnsi="Courier New" w:eastAsia="Courier New"/>
+                <w:color w:val="12365A"/>
+                <w:sz w:val="17"/>
+              </w:rPr>
+              <w:t>dependency-track-frontend</w:t>
+            </w:r>
+          </w:p>
+        </w:tc>
+        <w:tc>
+          <w:tcPr>
+            <w:tcW w:type="dxa" w:w="3099"/>
+            <w:vAlign w:val="center"/>
+            <w:shd w:fill="F4F7FA"/>
+          </w:tcPr>
+          <w:p>
+            <w:r>
+              <w:rPr>
+                <w:rFonts w:ascii="STHeiti" w:hAnsi="STHeiti" w:eastAsia="STHeiti"/>
+                <w:color w:val="263646"/>
+                <w:sz w:val="18"/>
+              </w:rPr>
+              <w:t>提供物流、在线文档编辑和 SBOM/漏洞辅助分析能力</w:t>
+            </w:r>
+          </w:p>
+        </w:tc>
+      </w:tr>
+      <w:tr>
+        <w:tc>
+          <w:tcPr>
+            <w:tcW w:type="dxa" w:w="3099"/>
+            <w:vAlign w:val="center"/>
+          </w:tcPr>
+          <w:p>
+            <w:r>
+              <w:rPr>
+                <w:rFonts w:ascii="STHeiti" w:hAnsi="STHeiti" w:eastAsia="STHeiti"/>
+                <w:color w:val="263646"/>
+                <w:sz w:val="18"/>
+              </w:rPr>
+              <w:t>数据与初始化层</w:t>
+            </w:r>
+          </w:p>
+        </w:tc>
+        <w:tc>
+          <w:tcPr>
+            <w:tcW w:type="dxa" w:w="3099"/>
+            <w:vAlign w:val="center"/>
+          </w:tcPr>
+          <w:p>
+            <w:r>
+              <w:rPr>
+                <w:rFonts w:ascii="Courier New" w:hAnsi="Courier New" w:eastAsia="Courier New"/>
+                <w:color w:val="12365A"/>
+                <w:sz w:val="17"/>
+              </w:rPr>
+              <w:t>mysql</w:t>
+            </w:r>
+            <w:r>
+              <w:rPr>
+                <w:rFonts w:ascii="STHeiti" w:hAnsi="STHeiti" w:eastAsia="STHeiti"/>
+                <w:color w:val="263646"/>
+                <w:sz w:val="18"/>
+              </w:rPr>
+              <w:t>、</w:t>
+            </w:r>
+            <w:r>
+              <w:rPr>
+                <w:rFonts w:ascii="Courier New" w:hAnsi="Courier New" w:eastAsia="Courier New"/>
+                <w:color w:val="12365A"/>
+                <w:sz w:val="17"/>
+              </w:rPr>
+              <w:t>sca-postgres</w:t>
+            </w:r>
+            <w:r>
+              <w:rPr>
+                <w:rFonts w:ascii="STHeiti" w:hAnsi="STHeiti" w:eastAsia="STHeiti"/>
+                <w:color w:val="263646"/>
+                <w:sz w:val="18"/>
+              </w:rPr>
+              <w:t>、</w:t>
+            </w:r>
+            <w:r>
+              <w:rPr>
+                <w:rFonts w:ascii="Courier New" w:hAnsi="Courier New" w:eastAsia="Courier New"/>
+                <w:color w:val="12365A"/>
+                <w:sz w:val="17"/>
+              </w:rPr>
+              <w:t>sca-redis</w:t>
+            </w:r>
+            <w:r>
+              <w:rPr>
+                <w:rFonts w:ascii="STHeiti" w:hAnsi="STHeiti" w:eastAsia="STHeiti"/>
+                <w:color w:val="263646"/>
+                <w:sz w:val="18"/>
+              </w:rPr>
+              <w:t>、</w:t>
+            </w:r>
+            <w:r>
+              <w:rPr>
+                <w:rFonts w:ascii="Courier New" w:hAnsi="Courier New" w:eastAsia="Courier New"/>
+                <w:color w:val="12365A"/>
+                <w:sz w:val="17"/>
+              </w:rPr>
+              <w:t>cmdb-mysql-init</w:t>
+            </w:r>
+          </w:p>
+        </w:tc>
+        <w:tc>
+          <w:tcPr>
+            <w:tcW w:type="dxa" w:w="3099"/>
+            <w:vAlign w:val="center"/>
+          </w:tcPr>
+          <w:p>
+            <w:r>
+              <w:rPr>
+                <w:rFonts w:ascii="STHeiti" w:hAnsi="STHeiti" w:eastAsia="STHeiti"/>
+                <w:color w:val="263646"/>
+                <w:sz w:val="18"/>
+              </w:rPr>
+              <w:t>提供关系型数据库、缓存/队列和一次性数据库初始化</w:t>
+            </w:r>
+          </w:p>
+        </w:tc>
+      </w:tr>
+    </w:tbl>
+    <w:p/>
+    <w:p>
+      <w:r>
+        <w:rPr>
+          <w:rFonts w:ascii="STHeiti" w:hAnsi="STHeiti" w:eastAsia="STHeiti"/>
+          <w:color w:val="263646"/>
+          <w:sz w:val="21"/>
+        </w:rPr>
+        <w:t>从高层设计角度看，Compose 同时承担三件事：</w:t>
       </w:r>
     </w:p>
     <w:p>
@@ -8098,21 +8810,61 @@
         <w:pStyle w:val="ListBullet"/>
         <w:ind w:left="397"/>
       </w:pPr>
+      <w:r>
+        <w:rPr>
+          <w:rFonts w:ascii="STHeiti" w:hAnsi="STHeiti" w:eastAsia="STHeiti"/>
+          <w:b/>
+          <w:color w:val="263646"/>
+          <w:sz w:val="21"/>
+        </w:rPr>
+        <w:t>运行编排</w:t>
+      </w:r>
+      <w:r>
+        <w:rPr>
+          <w:rFonts w:ascii="STHeiti" w:hAnsi="STHeiti" w:eastAsia="STHeiti"/>
+          <w:color w:val="263646"/>
+          <w:sz w:val="21"/>
+        </w:rPr>
+        <w:t>：定义服务、镜像、构建上下文、端口和依赖关系。</w:t>
+      </w:r>
+    </w:p>
+    <w:p>
+      <w:pPr>
+        <w:pStyle w:val="ListBullet"/>
+        <w:ind w:left="397"/>
+      </w:pPr>
+      <w:r>
+        <w:rPr>
+          <w:rFonts w:ascii="STHeiti" w:hAnsi="STHeiti" w:eastAsia="STHeiti"/>
+          <w:b/>
+          <w:color w:val="263646"/>
+          <w:sz w:val="21"/>
+        </w:rPr>
+        <w:t>环境注入</w:t>
+      </w:r>
+      <w:r>
+        <w:rPr>
+          <w:rFonts w:ascii="STHeiti" w:hAnsi="STHeiti" w:eastAsia="STHeiti"/>
+          <w:color w:val="263646"/>
+          <w:sz w:val="21"/>
+        </w:rPr>
+        <w:t xml:space="preserve">：通过 </w:t>
+      </w:r>
       <w:r>
         <w:rPr>
           <w:rFonts w:ascii="Courier New" w:hAnsi="Courier New" w:eastAsia="Courier New"/>
           <w:color w:val="12365A"/>
           <w:sz w:val="20"/>
         </w:rPr>
-        <w:t>.env.example</w:t>
-      </w:r>
-      <w:r>
-        <w:rPr>
-          <w:rFonts w:ascii="STHeiti" w:hAnsi="STHeiti" w:eastAsia="STHeiti"/>
-          <w:color w:val="263646"/>
-          <w:sz w:val="21"/>
-        </w:rPr>
-        <w:t xml:space="preserve"> 只提供变量结构，真实密码和密钥必须由部署环境提供。</w:t>
+        <w:t>.env</w:t>
+      </w:r>
+      <w:r>
+        <w:rPr>
+          <w:rFonts w:ascii="STHeiti" w:hAnsi="STHeiti" w:eastAsia="STHeiti"/>
+          <w:color w:val="263646"/>
+          <w:sz w:val="21"/>
+        </w:rPr>
+        <w:t>、环境变量和构建参数注入数据库、密钥、CORS、外部服务地址。</w:t>
       </w:r>
     </w:p>
     <w:p>
@@ -8123,10 +8875,37 @@
       <w:r>
         <w:rPr>
           <w:rFonts w:ascii="STHeiti" w:hAnsi="STHeiti" w:eastAsia="STHeiti"/>
-          <w:color w:val="263646"/>
-          <w:sz w:val="21"/>
-        </w:rPr>
-        <w:t>数据库密码、JWT 密钥、审计签名密钥、文档密钥和第三方令牌不得提交到 Git。</w:t>
+          <w:b/>
+          <w:color w:val="263646"/>
+          <w:sz w:val="21"/>
+        </w:rPr>
+        <w:t>数据挂载</w:t>
+      </w:r>
+      <w:r>
+        <w:rPr>
+          <w:rFonts w:ascii="STHeiti" w:hAnsi="STHeiti" w:eastAsia="STHeiti"/>
+          <w:color w:val="263646"/>
+          <w:sz w:val="21"/>
+        </w:rPr>
+        <w:t>：通过命名卷保存数据库、文档、上传文件、报告、SBOM、扫描结果和缓存。</w:t>
+      </w:r>
+    </w:p>
+    <w:p>
+      <w:pPr>
+        <w:pStyle w:val="Heading3"/>
+      </w:pPr>
+      <w:r>
+        <w:t>9.3 镜像与构建策略</w:t>
+      </w:r>
+    </w:p>
+    <w:p>
+      <w:r>
+        <w:rPr>
+          <w:rFonts w:ascii="STHeiti" w:hAnsi="STHeiti" w:eastAsia="STHeiti"/>
+          <w:color w:val="263646"/>
+          <w:sz w:val="21"/>
+        </w:rPr>
+        <w:t>Compose 中存在两类镜像来源：</w:t>
       </w:r>
     </w:p>
     <w:p>
@@ -8137,10 +8916,19 @@
       <w:r>
         <w:rPr>
           <w:rFonts w:ascii="STHeiti" w:hAnsi="STHeiti" w:eastAsia="STHeiti"/>
-          <w:color w:val="263646"/>
-          <w:sz w:val="21"/>
-        </w:rPr>
-        <w:t>生产环境应启用 HTTPS、安全 Cookie 和严格安全模式。</w:t>
+          <w:b/>
+          <w:color w:val="263646"/>
+          <w:sz w:val="21"/>
+        </w:rPr>
+        <w:t>本地构建镜像</w:t>
+      </w:r>
+      <w:r>
+        <w:rPr>
+          <w:rFonts w:ascii="STHeiti" w:hAnsi="STHeiti" w:eastAsia="STHeiti"/>
+          <w:color w:val="263646"/>
+          <w:sz w:val="21"/>
+        </w:rPr>
+        <w:t>：业务 API、业务前端、Auth、CMDB、SCA API/Worker、OnlyOffice 字体镜像等由仓库目录构建。</w:t>
       </w:r>
     </w:p>
     <w:p>
@@ -8151,10 +8939,29 @@
       <w:r>
         <w:rPr>
           <w:rFonts w:ascii="STHeiti" w:hAnsi="STHeiti" w:eastAsia="STHeiti"/>
-          <w:color w:val="263646"/>
-          <w:sz w:val="21"/>
-        </w:rPr>
-        <w:t>CORS 只允许实际使用的门户和业务域名。</w:t>
+          <w:b/>
+          <w:color w:val="263646"/>
+          <w:sz w:val="21"/>
+        </w:rPr>
+        <w:t>第三方基础镜像</w:t>
+      </w:r>
+      <w:r>
+        <w:rPr>
+          <w:rFonts w:ascii="STHeiti" w:hAnsi="STHeiti" w:eastAsia="STHeiti"/>
+          <w:color w:val="263646"/>
+          <w:sz w:val="21"/>
+        </w:rPr>
+        <w:t>：MySQL、PostgreSQL、Redis、Dependency-Track、Node、Nginx、Go、Alpine 等通过环境变量指定或使用默认镜像。</w:t>
+      </w:r>
+    </w:p>
+    <w:p>
+      <w:r>
+        <w:rPr>
+          <w:rFonts w:ascii="STHeiti" w:hAnsi="STHeiti" w:eastAsia="STHeiti"/>
+          <w:color w:val="263646"/>
+          <w:sz w:val="21"/>
+        </w:rPr>
+        <w:t>高层构建策略为：</w:t>
       </w:r>
     </w:p>
     <w:p>
@@ -8168,6 +8975,2248 @@
           <w:color w:val="263646"/>
           <w:sz w:val="21"/>
         </w:rPr>
+        <w:t>Node 系服务以 Node 20 为主，前端构建后由 Nginx 承载静态资源。</w:t>
+      </w:r>
+    </w:p>
+    <w:p>
+      <w:pPr>
+        <w:pStyle w:val="ListBullet"/>
+        <w:ind w:left="397"/>
+      </w:pPr>
+      <w:r>
+        <w:rPr>
+          <w:rFonts w:ascii="STHeiti" w:hAnsi="STHeiti" w:eastAsia="STHeiti"/>
+          <w:color w:val="263646"/>
+          <w:sz w:val="21"/>
+        </w:rPr>
+        <w:t>CMDB 使用 Go 1.22 构建。</w:t>
+      </w:r>
+    </w:p>
+    <w:p>
+      <w:pPr>
+        <w:pStyle w:val="ListBullet"/>
+        <w:ind w:left="397"/>
+      </w:pPr>
+      <w:r>
+        <w:rPr>
+          <w:rFonts w:ascii="STHeiti" w:hAnsi="STHeiti" w:eastAsia="STHeiti"/>
+          <w:color w:val="263646"/>
+          <w:sz w:val="21"/>
+        </w:rPr>
+        <w:t>SCA 后端使用 Python/FastAPI，并拆分普通运行镜像和扫描 Worker 镜像。</w:t>
+      </w:r>
+    </w:p>
+    <w:p>
+      <w:pPr>
+        <w:pStyle w:val="ListBullet"/>
+        <w:ind w:left="397"/>
+      </w:pPr>
+      <w:r>
+        <w:rPr>
+          <w:rFonts w:ascii="STHeiti" w:hAnsi="STHeiti" w:eastAsia="STHeiti"/>
+          <w:color w:val="263646"/>
+          <w:sz w:val="21"/>
+        </w:rPr>
+        <w:t xml:space="preserve">镜像源通过 </w:t>
+      </w:r>
+      <w:r>
+        <w:rPr>
+          <w:rFonts w:ascii="Courier New" w:hAnsi="Courier New" w:eastAsia="Courier New"/>
+          <w:color w:val="12365A"/>
+          <w:sz w:val="20"/>
+        </w:rPr>
+        <w:t>NODE_20_*_IMAGE</w:t>
+      </w:r>
+      <w:r>
+        <w:rPr>
+          <w:rFonts w:ascii="STHeiti" w:hAnsi="STHeiti" w:eastAsia="STHeiti"/>
+          <w:color w:val="263646"/>
+          <w:sz w:val="21"/>
+        </w:rPr>
+        <w:t>、</w:t>
+      </w:r>
+      <w:r>
+        <w:rPr>
+          <w:rFonts w:ascii="Courier New" w:hAnsi="Courier New" w:eastAsia="Courier New"/>
+          <w:color w:val="12365A"/>
+          <w:sz w:val="20"/>
+        </w:rPr>
+        <w:t>NGINX_ALPINE_IMAGE</w:t>
+      </w:r>
+      <w:r>
+        <w:rPr>
+          <w:rFonts w:ascii="STHeiti" w:hAnsi="STHeiti" w:eastAsia="STHeiti"/>
+          <w:color w:val="263646"/>
+          <w:sz w:val="21"/>
+        </w:rPr>
+        <w:t>、</w:t>
+      </w:r>
+      <w:r>
+        <w:rPr>
+          <w:rFonts w:ascii="Courier New" w:hAnsi="Courier New" w:eastAsia="Courier New"/>
+          <w:color w:val="12365A"/>
+          <w:sz w:val="20"/>
+        </w:rPr>
+        <w:t>MYSQL_IMAGE</w:t>
+      </w:r>
+      <w:r>
+        <w:rPr>
+          <w:rFonts w:ascii="STHeiti" w:hAnsi="STHeiti" w:eastAsia="STHeiti"/>
+          <w:color w:val="263646"/>
+          <w:sz w:val="21"/>
+        </w:rPr>
+        <w:t>、</w:t>
+      </w:r>
+      <w:r>
+        <w:rPr>
+          <w:rFonts w:ascii="Courier New" w:hAnsi="Courier New" w:eastAsia="Courier New"/>
+          <w:color w:val="12365A"/>
+          <w:sz w:val="20"/>
+        </w:rPr>
+        <w:t>ONLYOFFICE_DOCUMENTSERVER_IMAGE</w:t>
+      </w:r>
+      <w:r>
+        <w:rPr>
+          <w:rFonts w:ascii="STHeiti" w:hAnsi="STHeiti" w:eastAsia="STHeiti"/>
+          <w:color w:val="263646"/>
+          <w:sz w:val="21"/>
+        </w:rPr>
+        <w:t xml:space="preserve"> 等变量覆盖，便于在国内镜像源或企业私有仓库中部署。</w:t>
+      </w:r>
+    </w:p>
+    <w:p>
+      <w:pPr>
+        <w:pStyle w:val="ListBullet"/>
+        <w:ind w:left="397"/>
+      </w:pPr>
+      <w:r>
+        <w:rPr>
+          <w:rFonts w:ascii="STHeiti" w:hAnsi="STHeiti" w:eastAsia="STHeiti"/>
+          <w:color w:val="263646"/>
+          <w:sz w:val="21"/>
+        </w:rPr>
+        <w:t>日常启动优先复用已有镜像；代码变更、首次部署或基础镜像变化时再执行重建。</w:t>
+      </w:r>
+    </w:p>
+    <w:p>
+      <w:pPr>
+        <w:pStyle w:val="Heading3"/>
+      </w:pPr>
+      <w:r>
+        <w:t>9.4 端口暴露策略</w:t>
+      </w:r>
+    </w:p>
+    <w:p>
+      <w:r>
+        <w:rPr>
+          <w:rFonts w:ascii="STHeiti" w:hAnsi="STHeiti" w:eastAsia="STHeiti"/>
+          <w:color w:val="263646"/>
+          <w:sz w:val="21"/>
+        </w:rPr>
+        <w:t>当前端口映射按“门户、业务前端、业务 API、数据服务、辅助服务”分组：</w:t>
+      </w:r>
+    </w:p>
+    <w:tbl>
+      <w:tblPr>
+        <w:tblStyle w:val="TableGrid"/>
+        <w:tblW w:type="auto" w:w="0"/>
+        <w:jc w:val="center"/>
+        <w:tblLayout w:type="autofit"/>
+        <w:tblLook w:firstColumn="1" w:firstRow="1" w:lastColumn="0" w:lastRow="0" w:noHBand="0" w:noVBand="1" w:val="04A0"/>
+      </w:tblPr>
+      <w:tblGrid>
+        <w:gridCol w:w="3099"/>
+        <w:gridCol w:w="3099"/>
+        <w:gridCol w:w="3099"/>
+      </w:tblGrid>
+      <w:tr>
+        <w:trPr>
+          <w:tblHeader w:val="true"/>
+        </w:trPr>
+        <w:tc>
+          <w:tcPr>
+            <w:tcW w:type="dxa" w:w="3099"/>
+            <w:vAlign w:val="center"/>
+            <w:shd w:fill="12365A"/>
+          </w:tcPr>
+          <w:p>
+            <w:r>
+              <w:rPr>
+                <w:rFonts w:ascii="STHeiti" w:hAnsi="STHeiti" w:eastAsia="STHeiti"/>
+                <w:b/>
+                <w:color w:val="FFFFFF"/>
+                <w:sz w:val="18"/>
+              </w:rPr>
+              <w:t>类别</w:t>
+            </w:r>
+          </w:p>
+        </w:tc>
+        <w:tc>
+          <w:tcPr>
+            <w:tcW w:type="dxa" w:w="3099"/>
+            <w:vAlign w:val="center"/>
+            <w:shd w:fill="12365A"/>
+          </w:tcPr>
+          <w:p>
+            <w:r>
+              <w:rPr>
+                <w:rFonts w:ascii="STHeiti" w:hAnsi="STHeiti" w:eastAsia="STHeiti"/>
+                <w:b/>
+                <w:color w:val="FFFFFF"/>
+                <w:sz w:val="18"/>
+              </w:rPr>
+              <w:t>当前端口</w:t>
+            </w:r>
+          </w:p>
+        </w:tc>
+        <w:tc>
+          <w:tcPr>
+            <w:tcW w:type="dxa" w:w="3099"/>
+            <w:vAlign w:val="center"/>
+            <w:shd w:fill="12365A"/>
+          </w:tcPr>
+          <w:p>
+            <w:r>
+              <w:rPr>
+                <w:rFonts w:ascii="STHeiti" w:hAnsi="STHeiti" w:eastAsia="STHeiti"/>
+                <w:b/>
+                <w:color w:val="FFFFFF"/>
+                <w:sz w:val="18"/>
+              </w:rPr>
+              <w:t>说明</w:t>
+            </w:r>
+          </w:p>
+        </w:tc>
+      </w:tr>
+      <w:tr>
+        <w:tc>
+          <w:tcPr>
+            <w:tcW w:type="dxa" w:w="3099"/>
+            <w:vAlign w:val="center"/>
+          </w:tcPr>
+          <w:p>
+            <w:r>
+              <w:rPr>
+                <w:rFonts w:ascii="STHeiti" w:hAnsi="STHeiti" w:eastAsia="STHeiti"/>
+                <w:color w:val="263646"/>
+                <w:sz w:val="18"/>
+              </w:rPr>
+              <w:t>统一门户</w:t>
+            </w:r>
+          </w:p>
+        </w:tc>
+        <w:tc>
+          <w:tcPr>
+            <w:tcW w:type="dxa" w:w="3099"/>
+            <w:vAlign w:val="center"/>
+          </w:tcPr>
+          <w:p>
+            <w:r>
+              <w:rPr>
+                <w:rFonts w:ascii="Courier New" w:hAnsi="Courier New" w:eastAsia="Courier New"/>
+                <w:color w:val="12365A"/>
+                <w:sz w:val="17"/>
+              </w:rPr>
+              <w:t>5180</w:t>
+            </w:r>
+          </w:p>
+        </w:tc>
+        <w:tc>
+          <w:tcPr>
+            <w:tcW w:type="dxa" w:w="3099"/>
+            <w:vAlign w:val="center"/>
+          </w:tcPr>
+          <w:p>
+            <w:r>
+              <w:rPr>
+                <w:rFonts w:ascii="STHeiti" w:hAnsi="STHeiti" w:eastAsia="STHeiti"/>
+                <w:color w:val="263646"/>
+                <w:sz w:val="18"/>
+              </w:rPr>
+              <w:t>Auth、门户、管理中心、审计中心</w:t>
+            </w:r>
+          </w:p>
+        </w:tc>
+      </w:tr>
+      <w:tr>
+        <w:tc>
+          <w:tcPr>
+            <w:tcW w:type="dxa" w:w="3099"/>
+            <w:vAlign w:val="center"/>
+            <w:shd w:fill="F4F7FA"/>
+          </w:tcPr>
+          <w:p>
+            <w:r>
+              <w:rPr>
+                <w:rFonts w:ascii="STHeiti" w:hAnsi="STHeiti" w:eastAsia="STHeiti"/>
+                <w:color w:val="263646"/>
+                <w:sz w:val="18"/>
+              </w:rPr>
+              <w:t>业务前端</w:t>
+            </w:r>
+          </w:p>
+        </w:tc>
+        <w:tc>
+          <w:tcPr>
+            <w:tcW w:type="dxa" w:w="3099"/>
+            <w:vAlign w:val="center"/>
+            <w:shd w:fill="F4F7FA"/>
+          </w:tcPr>
+          <w:p>
+            <w:r>
+              <w:rPr>
+                <w:rFonts w:ascii="Courier New" w:hAnsi="Courier New" w:eastAsia="Courier New"/>
+                <w:color w:val="12365A"/>
+                <w:sz w:val="17"/>
+              </w:rPr>
+              <w:t>18080</w:t>
+            </w:r>
+            <w:r>
+              <w:rPr>
+                <w:rFonts w:ascii="STHeiti" w:hAnsi="STHeiti" w:eastAsia="STHeiti"/>
+                <w:color w:val="263646"/>
+                <w:sz w:val="18"/>
+              </w:rPr>
+              <w:t>、</w:t>
+            </w:r>
+            <w:r>
+              <w:rPr>
+                <w:rFonts w:ascii="Courier New" w:hAnsi="Courier New" w:eastAsia="Courier New"/>
+                <w:color w:val="12365A"/>
+                <w:sz w:val="17"/>
+              </w:rPr>
+              <w:t>18082</w:t>
+            </w:r>
+            <w:r>
+              <w:rPr>
+                <w:rFonts w:ascii="STHeiti" w:hAnsi="STHeiti" w:eastAsia="STHeiti"/>
+                <w:color w:val="263646"/>
+                <w:sz w:val="18"/>
+              </w:rPr>
+              <w:t>-</w:t>
+            </w:r>
+            <w:r>
+              <w:rPr>
+                <w:rFonts w:ascii="Courier New" w:hAnsi="Courier New" w:eastAsia="Courier New"/>
+                <w:color w:val="12365A"/>
+                <w:sz w:val="17"/>
+              </w:rPr>
+              <w:t>18089</w:t>
+            </w:r>
+            <w:r>
+              <w:rPr>
+                <w:rFonts w:ascii="STHeiti" w:hAnsi="STHeiti" w:eastAsia="STHeiti"/>
+                <w:color w:val="263646"/>
+                <w:sz w:val="18"/>
+              </w:rPr>
+              <w:t>、</w:t>
+            </w:r>
+            <w:r>
+              <w:rPr>
+                <w:rFonts w:ascii="Courier New" w:hAnsi="Courier New" w:eastAsia="Courier New"/>
+                <w:color w:val="12365A"/>
+                <w:sz w:val="17"/>
+              </w:rPr>
+              <w:t>18092</w:t>
+            </w:r>
+            <w:r>
+              <w:rPr>
+                <w:rFonts w:ascii="STHeiti" w:hAnsi="STHeiti" w:eastAsia="STHeiti"/>
+                <w:color w:val="263646"/>
+                <w:sz w:val="18"/>
+              </w:rPr>
+              <w:t>、</w:t>
+            </w:r>
+            <w:r>
+              <w:rPr>
+                <w:rFonts w:ascii="Courier New" w:hAnsi="Courier New" w:eastAsia="Courier New"/>
+                <w:color w:val="12365A"/>
+                <w:sz w:val="17"/>
+              </w:rPr>
+              <w:t>8090</w:t>
+            </w:r>
+          </w:p>
+        </w:tc>
+        <w:tc>
+          <w:tcPr>
+            <w:tcW w:type="dxa" w:w="3099"/>
+            <w:vAlign w:val="center"/>
+            <w:shd w:fill="F4F7FA"/>
+          </w:tcPr>
+          <w:p>
+            <w:r>
+              <w:rPr>
+                <w:rFonts w:ascii="STHeiti" w:hAnsi="STHeiti" w:eastAsia="STHeiti"/>
+                <w:color w:val="263646"/>
+                <w:sz w:val="18"/>
+              </w:rPr>
+              <w:t>Reminder、Inventory、Device Flow、Delivery、FAQ、Tender、Train Exam、Prompt Center、SCA、Big Screen、CMDB</w:t>
+            </w:r>
+          </w:p>
+        </w:tc>
+      </w:tr>
+      <w:tr>
+        <w:tc>
+          <w:tcPr>
+            <w:tcW w:type="dxa" w:w="3099"/>
+            <w:vAlign w:val="center"/>
+          </w:tcPr>
+          <w:p>
+            <w:r>
+              <w:rPr>
+                <w:rFonts w:ascii="STHeiti" w:hAnsi="STHeiti" w:eastAsia="STHeiti"/>
+                <w:color w:val="263646"/>
+                <w:sz w:val="18"/>
+              </w:rPr>
+              <w:t>业务 API</w:t>
+            </w:r>
+          </w:p>
+        </w:tc>
+        <w:tc>
+          <w:tcPr>
+            <w:tcW w:type="dxa" w:w="3099"/>
+            <w:vAlign w:val="center"/>
+          </w:tcPr>
+          <w:p>
+            <w:r>
+              <w:rPr>
+                <w:rFonts w:ascii="Courier New" w:hAnsi="Courier New" w:eastAsia="Courier New"/>
+                <w:color w:val="12365A"/>
+                <w:sz w:val="17"/>
+              </w:rPr>
+              <w:t>5179</w:t>
+            </w:r>
+            <w:r>
+              <w:rPr>
+                <w:rFonts w:ascii="STHeiti" w:hAnsi="STHeiti" w:eastAsia="STHeiti"/>
+                <w:color w:val="263646"/>
+                <w:sz w:val="18"/>
+              </w:rPr>
+              <w:t>、</w:t>
+            </w:r>
+            <w:r>
+              <w:rPr>
+                <w:rFonts w:ascii="Courier New" w:hAnsi="Courier New" w:eastAsia="Courier New"/>
+                <w:color w:val="12365A"/>
+                <w:sz w:val="17"/>
+              </w:rPr>
+              <w:t>5183</w:t>
+            </w:r>
+            <w:r>
+              <w:rPr>
+                <w:rFonts w:ascii="STHeiti" w:hAnsi="STHeiti" w:eastAsia="STHeiti"/>
+                <w:color w:val="263646"/>
+                <w:sz w:val="18"/>
+              </w:rPr>
+              <w:t>-</w:t>
+            </w:r>
+            <w:r>
+              <w:rPr>
+                <w:rFonts w:ascii="Courier New" w:hAnsi="Courier New" w:eastAsia="Courier New"/>
+                <w:color w:val="12365A"/>
+                <w:sz w:val="17"/>
+              </w:rPr>
+              <w:t>5189</w:t>
+            </w:r>
+            <w:r>
+              <w:rPr>
+                <w:rFonts w:ascii="STHeiti" w:hAnsi="STHeiti" w:eastAsia="STHeiti"/>
+                <w:color w:val="263646"/>
+                <w:sz w:val="18"/>
+              </w:rPr>
+              <w:t>、</w:t>
+            </w:r>
+            <w:r>
+              <w:rPr>
+                <w:rFonts w:ascii="Courier New" w:hAnsi="Courier New" w:eastAsia="Courier New"/>
+                <w:color w:val="12365A"/>
+                <w:sz w:val="17"/>
+              </w:rPr>
+              <w:t>5191</w:t>
+            </w:r>
+            <w:r>
+              <w:rPr>
+                <w:rFonts w:ascii="STHeiti" w:hAnsi="STHeiti" w:eastAsia="STHeiti"/>
+                <w:color w:val="263646"/>
+                <w:sz w:val="18"/>
+              </w:rPr>
+              <w:t>、</w:t>
+            </w:r>
+            <w:r>
+              <w:rPr>
+                <w:rFonts w:ascii="Courier New" w:hAnsi="Courier New" w:eastAsia="Courier New"/>
+                <w:color w:val="12365A"/>
+                <w:sz w:val="17"/>
+              </w:rPr>
+              <w:t>5192</w:t>
+            </w:r>
+          </w:p>
+        </w:tc>
+        <w:tc>
+          <w:tcPr>
+            <w:tcW w:type="dxa" w:w="3099"/>
+            <w:vAlign w:val="center"/>
+          </w:tcPr>
+          <w:p>
+            <w:r>
+              <w:rPr>
+                <w:rFonts w:ascii="STHeiti" w:hAnsi="STHeiti" w:eastAsia="STHeiti"/>
+                <w:color w:val="263646"/>
+                <w:sz w:val="18"/>
+              </w:rPr>
+              <w:t>各业务后端 API</w:t>
+            </w:r>
+          </w:p>
+        </w:tc>
+      </w:tr>
+      <w:tr>
+        <w:tc>
+          <w:tcPr>
+            <w:tcW w:type="dxa" w:w="3099"/>
+            <w:vAlign w:val="center"/>
+            <w:shd w:fill="F4F7FA"/>
+          </w:tcPr>
+          <w:p>
+            <w:r>
+              <w:rPr>
+                <w:rFonts w:ascii="STHeiti" w:hAnsi="STHeiti" w:eastAsia="STHeiti"/>
+                <w:color w:val="263646"/>
+                <w:sz w:val="18"/>
+              </w:rPr>
+              <w:t>集成服务</w:t>
+            </w:r>
+          </w:p>
+        </w:tc>
+        <w:tc>
+          <w:tcPr>
+            <w:tcW w:type="dxa" w:w="3099"/>
+            <w:vAlign w:val="center"/>
+            <w:shd w:fill="F4F7FA"/>
+          </w:tcPr>
+          <w:p>
+            <w:r>
+              <w:rPr>
+                <w:rFonts w:ascii="Courier New" w:hAnsi="Courier New" w:eastAsia="Courier New"/>
+                <w:color w:val="12365A"/>
+                <w:sz w:val="17"/>
+              </w:rPr>
+              <w:t>5190</w:t>
+            </w:r>
+            <w:r>
+              <w:rPr>
+                <w:rFonts w:ascii="STHeiti" w:hAnsi="STHeiti" w:eastAsia="STHeiti"/>
+                <w:color w:val="263646"/>
+                <w:sz w:val="18"/>
+              </w:rPr>
+              <w:t>、</w:t>
+            </w:r>
+            <w:r>
+              <w:rPr>
+                <w:rFonts w:ascii="Courier New" w:hAnsi="Courier New" w:eastAsia="Courier New"/>
+                <w:color w:val="12365A"/>
+                <w:sz w:val="17"/>
+              </w:rPr>
+              <w:t>18090</w:t>
+            </w:r>
+            <w:r>
+              <w:rPr>
+                <w:rFonts w:ascii="STHeiti" w:hAnsi="STHeiti" w:eastAsia="STHeiti"/>
+                <w:color w:val="263646"/>
+                <w:sz w:val="18"/>
+              </w:rPr>
+              <w:t>、</w:t>
+            </w:r>
+            <w:r>
+              <w:rPr>
+                <w:rFonts w:ascii="Courier New" w:hAnsi="Courier New" w:eastAsia="Courier New"/>
+                <w:color w:val="12365A"/>
+                <w:sz w:val="17"/>
+              </w:rPr>
+              <w:t>18091</w:t>
+            </w:r>
+          </w:p>
+        </w:tc>
+        <w:tc>
+          <w:tcPr>
+            <w:tcW w:type="dxa" w:w="3099"/>
+            <w:vAlign w:val="center"/>
+            <w:shd w:fill="F4F7FA"/>
+          </w:tcPr>
+          <w:p>
+            <w:r>
+              <w:rPr>
+                <w:rFonts w:ascii="STHeiti" w:hAnsi="STHeiti" w:eastAsia="STHeiti"/>
+                <w:color w:val="263646"/>
+                <w:sz w:val="18"/>
+              </w:rPr>
+              <w:t>物流网关、Dependency-Track API 和前端</w:t>
+            </w:r>
+          </w:p>
+        </w:tc>
+      </w:tr>
+      <w:tr>
+        <w:tc>
+          <w:tcPr>
+            <w:tcW w:type="dxa" w:w="3099"/>
+            <w:vAlign w:val="center"/>
+          </w:tcPr>
+          <w:p>
+            <w:r>
+              <w:rPr>
+                <w:rFonts w:ascii="STHeiti" w:hAnsi="STHeiti" w:eastAsia="STHeiti"/>
+                <w:color w:val="263646"/>
+                <w:sz w:val="18"/>
+              </w:rPr>
+              <w:t>数据服务</w:t>
+            </w:r>
+          </w:p>
+        </w:tc>
+        <w:tc>
+          <w:tcPr>
+            <w:tcW w:type="dxa" w:w="3099"/>
+            <w:vAlign w:val="center"/>
+          </w:tcPr>
+          <w:p>
+            <w:r>
+              <w:rPr>
+                <w:rFonts w:ascii="Courier New" w:hAnsi="Courier New" w:eastAsia="Courier New"/>
+                <w:color w:val="12365A"/>
+                <w:sz w:val="17"/>
+              </w:rPr>
+              <w:t>53308</w:t>
+            </w:r>
+            <w:r>
+              <w:rPr>
+                <w:rFonts w:ascii="STHeiti" w:hAnsi="STHeiti" w:eastAsia="STHeiti"/>
+                <w:color w:val="263646"/>
+                <w:sz w:val="18"/>
+              </w:rPr>
+              <w:t>、</w:t>
+            </w:r>
+            <w:r>
+              <w:rPr>
+                <w:rFonts w:ascii="Courier New" w:hAnsi="Courier New" w:eastAsia="Courier New"/>
+                <w:color w:val="12365A"/>
+                <w:sz w:val="17"/>
+              </w:rPr>
+              <w:t>55433</w:t>
+            </w:r>
+            <w:r>
+              <w:rPr>
+                <w:rFonts w:ascii="STHeiti" w:hAnsi="STHeiti" w:eastAsia="STHeiti"/>
+                <w:color w:val="263646"/>
+                <w:sz w:val="18"/>
+              </w:rPr>
+              <w:t>、</w:t>
+            </w:r>
+            <w:r>
+              <w:rPr>
+                <w:rFonts w:ascii="Courier New" w:hAnsi="Courier New" w:eastAsia="Courier New"/>
+                <w:color w:val="12365A"/>
+                <w:sz w:val="17"/>
+              </w:rPr>
+              <w:t>56380</w:t>
+            </w:r>
+          </w:p>
+        </w:tc>
+        <w:tc>
+          <w:tcPr>
+            <w:tcW w:type="dxa" w:w="3099"/>
+            <w:vAlign w:val="center"/>
+          </w:tcPr>
+          <w:p>
+            <w:r>
+              <w:rPr>
+                <w:rFonts w:ascii="STHeiti" w:hAnsi="STHeiti" w:eastAsia="STHeiti"/>
+                <w:color w:val="263646"/>
+                <w:sz w:val="18"/>
+              </w:rPr>
+              <w:t>MySQL、SCA PostgreSQL、SCA Redis 的宿主机映射</w:t>
+            </w:r>
+          </w:p>
+        </w:tc>
+      </w:tr>
+      <w:tr>
+        <w:tc>
+          <w:tcPr>
+            <w:tcW w:type="dxa" w:w="3099"/>
+            <w:vAlign w:val="center"/>
+            <w:shd w:fill="F4F7FA"/>
+          </w:tcPr>
+          <w:p>
+            <w:r>
+              <w:rPr>
+                <w:rFonts w:ascii="STHeiti" w:hAnsi="STHeiti" w:eastAsia="STHeiti"/>
+                <w:color w:val="263646"/>
+                <w:sz w:val="18"/>
+              </w:rPr>
+              <w:t>历史兼容</w:t>
+            </w:r>
+          </w:p>
+        </w:tc>
+        <w:tc>
+          <w:tcPr>
+            <w:tcW w:type="dxa" w:w="3099"/>
+            <w:vAlign w:val="center"/>
+            <w:shd w:fill="F4F7FA"/>
+          </w:tcPr>
+          <w:p>
+            <w:r>
+              <w:rPr>
+                <w:rFonts w:ascii="Courier New" w:hAnsi="Courier New" w:eastAsia="Courier New"/>
+                <w:color w:val="12365A"/>
+                <w:sz w:val="17"/>
+              </w:rPr>
+              <w:t>18081</w:t>
+            </w:r>
+            <w:r>
+              <w:rPr>
+                <w:rFonts w:ascii="STHeiti" w:hAnsi="STHeiti" w:eastAsia="STHeiti"/>
+                <w:color w:val="263646"/>
+                <w:sz w:val="18"/>
+              </w:rPr>
+              <w:t>、</w:t>
+            </w:r>
+            <w:r>
+              <w:rPr>
+                <w:rFonts w:ascii="Courier New" w:hAnsi="Courier New" w:eastAsia="Courier New"/>
+                <w:color w:val="12365A"/>
+                <w:sz w:val="17"/>
+              </w:rPr>
+              <w:t>5182</w:t>
+            </w:r>
+          </w:p>
+        </w:tc>
+        <w:tc>
+          <w:tcPr>
+            <w:tcW w:type="dxa" w:w="3099"/>
+            <w:vAlign w:val="center"/>
+            <w:shd w:fill="F4F7FA"/>
+          </w:tcPr>
+          <w:p>
+            <w:r>
+              <w:rPr>
+                <w:rFonts w:ascii="STHeiti" w:hAnsi="STHeiti" w:eastAsia="STHeiti"/>
+                <w:color w:val="263646"/>
+                <w:sz w:val="18"/>
+              </w:rPr>
+              <w:t>Ticketing 前后端仍存在于 Compose，但不作为现役门户入口</w:t>
+            </w:r>
+          </w:p>
+        </w:tc>
+      </w:tr>
+    </w:tbl>
+    <w:p/>
+    <w:p>
+      <w:r>
+        <w:rPr>
+          <w:rFonts w:ascii="STHeiti" w:hAnsi="STHeiti" w:eastAsia="STHeiti"/>
+          <w:color w:val="263646"/>
+          <w:sz w:val="21"/>
+        </w:rPr>
+        <w:t>生产环境建议：</w:t>
+      </w:r>
+    </w:p>
+    <w:p>
+      <w:pPr>
+        <w:pStyle w:val="ListBullet"/>
+        <w:ind w:left="397"/>
+      </w:pPr>
+      <w:r>
+        <w:rPr>
+          <w:rFonts w:ascii="STHeiti" w:hAnsi="STHeiti" w:eastAsia="STHeiti"/>
+          <w:color w:val="263646"/>
+          <w:sz w:val="21"/>
+        </w:rPr>
+        <w:t>只通过统一 HTTPS 入口暴露门户和业务前端。</w:t>
+      </w:r>
+    </w:p>
+    <w:p>
+      <w:pPr>
+        <w:pStyle w:val="ListBullet"/>
+        <w:ind w:left="397"/>
+      </w:pPr>
+      <w:r>
+        <w:rPr>
+          <w:rFonts w:ascii="STHeiti" w:hAnsi="STHeiti" w:eastAsia="STHeiti"/>
+          <w:color w:val="263646"/>
+          <w:sz w:val="21"/>
+        </w:rPr>
+        <w:t>数据库、Redis、Dependency-Track 管理入口不直接暴露公网。</w:t>
+      </w:r>
+    </w:p>
+    <w:p>
+      <w:pPr>
+        <w:pStyle w:val="ListBullet"/>
+        <w:ind w:left="397"/>
+      </w:pPr>
+      <w:r>
+        <w:rPr>
+          <w:rFonts w:ascii="STHeiti" w:hAnsi="STHeiti" w:eastAsia="STHeiti"/>
+          <w:color w:val="263646"/>
+          <w:sz w:val="21"/>
+        </w:rPr>
+        <w:t>业务 API 优先由反向代理或内网访问控制承载。</w:t>
+      </w:r>
+    </w:p>
+    <w:p>
+      <w:pPr>
+        <w:pStyle w:val="ListBullet"/>
+        <w:ind w:left="397"/>
+      </w:pPr>
+      <w:r>
+        <w:rPr>
+          <w:rFonts w:ascii="STHeiti" w:hAnsi="STHeiti" w:eastAsia="STHeiti"/>
+          <w:color w:val="263646"/>
+          <w:sz w:val="21"/>
+        </w:rPr>
+        <w:t>端口映射应形成环境清单，避免测试环境和生产环境混用。</w:t>
+      </w:r>
+    </w:p>
+    <w:p>
+      <w:pPr>
+        <w:pStyle w:val="Heading3"/>
+      </w:pPr>
+      <w:r>
+        <w:t>9.5 数据卷与持久化策略</w:t>
+      </w:r>
+    </w:p>
+    <w:p>
+      <w:r>
+        <w:rPr>
+          <w:rFonts w:ascii="STHeiti" w:hAnsi="STHeiti" w:eastAsia="STHeiti"/>
+          <w:color w:val="263646"/>
+          <w:sz w:val="21"/>
+        </w:rPr>
+        <w:t>当前 Compose 定义的持久化卷包括：</w:t>
+      </w:r>
+    </w:p>
+    <w:tbl>
+      <w:tblPr>
+        <w:tblStyle w:val="TableGrid"/>
+        <w:tblW w:type="auto" w:w="0"/>
+        <w:jc w:val="center"/>
+        <w:tblLayout w:type="autofit"/>
+        <w:tblLook w:firstColumn="1" w:firstRow="1" w:lastColumn="0" w:lastRow="0" w:noHBand="0" w:noVBand="1" w:val="04A0"/>
+      </w:tblPr>
+      <w:tblGrid>
+        <w:gridCol w:w="3099"/>
+        <w:gridCol w:w="3099"/>
+        <w:gridCol w:w="3099"/>
+      </w:tblGrid>
+      <w:tr>
+        <w:trPr>
+          <w:tblHeader w:val="true"/>
+        </w:trPr>
+        <w:tc>
+          <w:tcPr>
+            <w:tcW w:type="dxa" w:w="3099"/>
+            <w:vAlign w:val="center"/>
+            <w:shd w:fill="12365A"/>
+          </w:tcPr>
+          <w:p>
+            <w:r>
+              <w:rPr>
+                <w:rFonts w:ascii="STHeiti" w:hAnsi="STHeiti" w:eastAsia="STHeiti"/>
+                <w:b/>
+                <w:color w:val="FFFFFF"/>
+                <w:sz w:val="18"/>
+              </w:rPr>
+              <w:t>数据卷</w:t>
+            </w:r>
+          </w:p>
+        </w:tc>
+        <w:tc>
+          <w:tcPr>
+            <w:tcW w:type="dxa" w:w="3099"/>
+            <w:vAlign w:val="center"/>
+            <w:shd w:fill="12365A"/>
+          </w:tcPr>
+          <w:p>
+            <w:r>
+              <w:rPr>
+                <w:rFonts w:ascii="STHeiti" w:hAnsi="STHeiti" w:eastAsia="STHeiti"/>
+                <w:b/>
+                <w:color w:val="FFFFFF"/>
+                <w:sz w:val="18"/>
+              </w:rPr>
+              <w:t>主要使用方</w:t>
+            </w:r>
+          </w:p>
+        </w:tc>
+        <w:tc>
+          <w:tcPr>
+            <w:tcW w:type="dxa" w:w="3099"/>
+            <w:vAlign w:val="center"/>
+            <w:shd w:fill="12365A"/>
+          </w:tcPr>
+          <w:p>
+            <w:r>
+              <w:rPr>
+                <w:rFonts w:ascii="STHeiti" w:hAnsi="STHeiti" w:eastAsia="STHeiti"/>
+                <w:b/>
+                <w:color w:val="FFFFFF"/>
+                <w:sz w:val="18"/>
+              </w:rPr>
+              <w:t>保存内容</w:t>
+            </w:r>
+          </w:p>
+        </w:tc>
+      </w:tr>
+      <w:tr>
+        <w:tc>
+          <w:tcPr>
+            <w:tcW w:type="dxa" w:w="3099"/>
+            <w:vAlign w:val="center"/>
+          </w:tcPr>
+          <w:p>
+            <w:r>
+              <w:rPr>
+                <w:rFonts w:ascii="Courier New" w:hAnsi="Courier New" w:eastAsia="Courier New"/>
+                <w:color w:val="12365A"/>
+                <w:sz w:val="17"/>
+              </w:rPr>
+              <w:t>mysql-data</w:t>
+            </w:r>
+          </w:p>
+        </w:tc>
+        <w:tc>
+          <w:tcPr>
+            <w:tcW w:type="dxa" w:w="3099"/>
+            <w:vAlign w:val="center"/>
+          </w:tcPr>
+          <w:p>
+            <w:r>
+              <w:rPr>
+                <w:rFonts w:ascii="STHeiti" w:hAnsi="STHeiti" w:eastAsia="STHeiti"/>
+                <w:color w:val="263646"/>
+                <w:sz w:val="18"/>
+              </w:rPr>
+              <w:t>MySQL</w:t>
+            </w:r>
+          </w:p>
+        </w:tc>
+        <w:tc>
+          <w:tcPr>
+            <w:tcW w:type="dxa" w:w="3099"/>
+            <w:vAlign w:val="center"/>
+          </w:tcPr>
+          <w:p>
+            <w:r>
+              <w:rPr>
+                <w:rFonts w:ascii="STHeiti" w:hAnsi="STHeiti" w:eastAsia="STHeiti"/>
+                <w:color w:val="263646"/>
+                <w:sz w:val="18"/>
+              </w:rPr>
+              <w:t>Auth、Reminder、Delivery、CMDB、Inventory、Device、FAQ、Tender、Train、Prompt、Big Screen 等 MySQL 数据</w:t>
+            </w:r>
+          </w:p>
+        </w:tc>
+      </w:tr>
+      <w:tr>
+        <w:tc>
+          <w:tcPr>
+            <w:tcW w:type="dxa" w:w="3099"/>
+            <w:vAlign w:val="center"/>
+            <w:shd w:fill="F4F7FA"/>
+          </w:tcPr>
+          <w:p>
+            <w:r>
+              <w:rPr>
+                <w:rFonts w:ascii="Courier New" w:hAnsi="Courier New" w:eastAsia="Courier New"/>
+                <w:color w:val="12365A"/>
+                <w:sz w:val="17"/>
+              </w:rPr>
+              <w:t>faq-data</w:t>
+            </w:r>
+          </w:p>
+        </w:tc>
+        <w:tc>
+          <w:tcPr>
+            <w:tcW w:type="dxa" w:w="3099"/>
+            <w:vAlign w:val="center"/>
+            <w:shd w:fill="F4F7FA"/>
+          </w:tcPr>
+          <w:p>
+            <w:r>
+              <w:rPr>
+                <w:rFonts w:ascii="STHeiti" w:hAnsi="STHeiti" w:eastAsia="STHeiti"/>
+                <w:color w:val="263646"/>
+                <w:sz w:val="18"/>
+              </w:rPr>
+              <w:t>FAQ</w:t>
+            </w:r>
+          </w:p>
+        </w:tc>
+        <w:tc>
+          <w:tcPr>
+            <w:tcW w:type="dxa" w:w="3099"/>
+            <w:vAlign w:val="center"/>
+            <w:shd w:fill="F4F7FA"/>
+          </w:tcPr>
+          <w:p>
+            <w:r>
+              <w:rPr>
+                <w:rFonts w:ascii="STHeiti" w:hAnsi="STHeiti" w:eastAsia="STHeiti"/>
+                <w:color w:val="263646"/>
+                <w:sz w:val="18"/>
+              </w:rPr>
+              <w:t>上传文件、预览、草稿和可编辑文档</w:t>
+            </w:r>
+          </w:p>
+        </w:tc>
+      </w:tr>
+      <w:tr>
+        <w:tc>
+          <w:tcPr>
+            <w:tcW w:type="dxa" w:w="3099"/>
+            <w:vAlign w:val="center"/>
+          </w:tcPr>
+          <w:p>
+            <w:r>
+              <w:rPr>
+                <w:rFonts w:ascii="Courier New" w:hAnsi="Courier New" w:eastAsia="Courier New"/>
+                <w:color w:val="12365A"/>
+                <w:sz w:val="17"/>
+              </w:rPr>
+              <w:t>tender-data</w:t>
+            </w:r>
+          </w:p>
+        </w:tc>
+        <w:tc>
+          <w:tcPr>
+            <w:tcW w:type="dxa" w:w="3099"/>
+            <w:vAlign w:val="center"/>
+          </w:tcPr>
+          <w:p>
+            <w:r>
+              <w:rPr>
+                <w:rFonts w:ascii="STHeiti" w:hAnsi="STHeiti" w:eastAsia="STHeiti"/>
+                <w:color w:val="263646"/>
+                <w:sz w:val="18"/>
+              </w:rPr>
+              <w:t>Tender</w:t>
+            </w:r>
+          </w:p>
+        </w:tc>
+        <w:tc>
+          <w:tcPr>
+            <w:tcW w:type="dxa" w:w="3099"/>
+            <w:vAlign w:val="center"/>
+          </w:tcPr>
+          <w:p>
+            <w:r>
+              <w:rPr>
+                <w:rFonts w:ascii="STHeiti" w:hAnsi="STHeiti" w:eastAsia="STHeiti"/>
+                <w:color w:val="263646"/>
+                <w:sz w:val="18"/>
+              </w:rPr>
+              <w:t>标书上传、版本、草稿、素材、水印、预览和编辑文件</w:t>
+            </w:r>
+          </w:p>
+        </w:tc>
+      </w:tr>
+      <w:tr>
+        <w:tc>
+          <w:tcPr>
+            <w:tcW w:type="dxa" w:w="3099"/>
+            <w:vAlign w:val="center"/>
+            <w:shd w:fill="F4F7FA"/>
+          </w:tcPr>
+          <w:p>
+            <w:r>
+              <w:rPr>
+                <w:rFonts w:ascii="Courier New" w:hAnsi="Courier New" w:eastAsia="Courier New"/>
+                <w:color w:val="12365A"/>
+                <w:sz w:val="17"/>
+              </w:rPr>
+              <w:t>train-exam-data</w:t>
+            </w:r>
+          </w:p>
+        </w:tc>
+        <w:tc>
+          <w:tcPr>
+            <w:tcW w:type="dxa" w:w="3099"/>
+            <w:vAlign w:val="center"/>
+            <w:shd w:fill="F4F7FA"/>
+          </w:tcPr>
+          <w:p>
+            <w:r>
+              <w:rPr>
+                <w:rFonts w:ascii="STHeiti" w:hAnsi="STHeiti" w:eastAsia="STHeiti"/>
+                <w:color w:val="263646"/>
+                <w:sz w:val="18"/>
+              </w:rPr>
+              <w:t>Train Exam</w:t>
+            </w:r>
+          </w:p>
+        </w:tc>
+        <w:tc>
+          <w:tcPr>
+            <w:tcW w:type="dxa" w:w="3099"/>
+            <w:vAlign w:val="center"/>
+            <w:shd w:fill="F4F7FA"/>
+          </w:tcPr>
+          <w:p>
+            <w:r>
+              <w:rPr>
+                <w:rFonts w:ascii="STHeiti" w:hAnsi="STHeiti" w:eastAsia="STHeiti"/>
+                <w:color w:val="263646"/>
+                <w:sz w:val="18"/>
+              </w:rPr>
+              <w:t>课程资源、导入文件和证书</w:t>
+            </w:r>
+          </w:p>
+        </w:tc>
+      </w:tr>
+      <w:tr>
+        <w:tc>
+          <w:tcPr>
+            <w:tcW w:type="dxa" w:w="3099"/>
+            <w:vAlign w:val="center"/>
+          </w:tcPr>
+          <w:p>
+            <w:r>
+              <w:rPr>
+                <w:rFonts w:ascii="Courier New" w:hAnsi="Courier New" w:eastAsia="Courier New"/>
+                <w:color w:val="12365A"/>
+                <w:sz w:val="17"/>
+              </w:rPr>
+              <w:t>sca-postgres-data</w:t>
+            </w:r>
+          </w:p>
+        </w:tc>
+        <w:tc>
+          <w:tcPr>
+            <w:tcW w:type="dxa" w:w="3099"/>
+            <w:vAlign w:val="center"/>
+          </w:tcPr>
+          <w:p>
+            <w:r>
+              <w:rPr>
+                <w:rFonts w:ascii="STHeiti" w:hAnsi="STHeiti" w:eastAsia="STHeiti"/>
+                <w:color w:val="263646"/>
+                <w:sz w:val="18"/>
+              </w:rPr>
+              <w:t>SCA PostgreSQL</w:t>
+            </w:r>
+          </w:p>
+        </w:tc>
+        <w:tc>
+          <w:tcPr>
+            <w:tcW w:type="dxa" w:w="3099"/>
+            <w:vAlign w:val="center"/>
+          </w:tcPr>
+          <w:p>
+            <w:r>
+              <w:rPr>
+                <w:rFonts w:ascii="STHeiti" w:hAnsi="STHeiti" w:eastAsia="STHeiti"/>
+                <w:color w:val="263646"/>
+                <w:sz w:val="18"/>
+              </w:rPr>
+              <w:t>SCA 与 Dependency-Track 关系型数据</w:t>
+            </w:r>
+          </w:p>
+        </w:tc>
+      </w:tr>
+      <w:tr>
+        <w:tc>
+          <w:tcPr>
+            <w:tcW w:type="dxa" w:w="3099"/>
+            <w:vAlign w:val="center"/>
+            <w:shd w:fill="F4F7FA"/>
+          </w:tcPr>
+          <w:p>
+            <w:r>
+              <w:rPr>
+                <w:rFonts w:ascii="Courier New" w:hAnsi="Courier New" w:eastAsia="Courier New"/>
+                <w:color w:val="12365A"/>
+                <w:sz w:val="17"/>
+              </w:rPr>
+              <w:t>sca-redis-data</w:t>
+            </w:r>
+          </w:p>
+        </w:tc>
+        <w:tc>
+          <w:tcPr>
+            <w:tcW w:type="dxa" w:w="3099"/>
+            <w:vAlign w:val="center"/>
+            <w:shd w:fill="F4F7FA"/>
+          </w:tcPr>
+          <w:p>
+            <w:r>
+              <w:rPr>
+                <w:rFonts w:ascii="STHeiti" w:hAnsi="STHeiti" w:eastAsia="STHeiti"/>
+                <w:color w:val="263646"/>
+                <w:sz w:val="18"/>
+              </w:rPr>
+              <w:t>SCA Redis</w:t>
+            </w:r>
+          </w:p>
+        </w:tc>
+        <w:tc>
+          <w:tcPr>
+            <w:tcW w:type="dxa" w:w="3099"/>
+            <w:vAlign w:val="center"/>
+            <w:shd w:fill="F4F7FA"/>
+          </w:tcPr>
+          <w:p>
+            <w:r>
+              <w:rPr>
+                <w:rFonts w:ascii="STHeiti" w:hAnsi="STHeiti" w:eastAsia="STHeiti"/>
+                <w:color w:val="263646"/>
+                <w:sz w:val="18"/>
+              </w:rPr>
+              <w:t>Redis AOF、缓存、任务状态相关数据</w:t>
+            </w:r>
+          </w:p>
+        </w:tc>
+      </w:tr>
+      <w:tr>
+        <w:tc>
+          <w:tcPr>
+            <w:tcW w:type="dxa" w:w="3099"/>
+            <w:vAlign w:val="center"/>
+          </w:tcPr>
+          <w:p>
+            <w:r>
+              <w:rPr>
+                <w:rFonts w:ascii="Courier New" w:hAnsi="Courier New" w:eastAsia="Courier New"/>
+                <w:color w:val="12365A"/>
+                <w:sz w:val="17"/>
+              </w:rPr>
+              <w:t>sca-upload-data</w:t>
+            </w:r>
+          </w:p>
+        </w:tc>
+        <w:tc>
+          <w:tcPr>
+            <w:tcW w:type="dxa" w:w="3099"/>
+            <w:vAlign w:val="center"/>
+          </w:tcPr>
+          <w:p>
+            <w:r>
+              <w:rPr>
+                <w:rFonts w:ascii="STHeiti" w:hAnsi="STHeiti" w:eastAsia="STHeiti"/>
+                <w:color w:val="263646"/>
+                <w:sz w:val="18"/>
+              </w:rPr>
+              <w:t>SCA</w:t>
+            </w:r>
+          </w:p>
+        </w:tc>
+        <w:tc>
+          <w:tcPr>
+            <w:tcW w:type="dxa" w:w="3099"/>
+            <w:vAlign w:val="center"/>
+          </w:tcPr>
+          <w:p>
+            <w:r>
+              <w:rPr>
+                <w:rFonts w:ascii="STHeiti" w:hAnsi="STHeiti" w:eastAsia="STHeiti"/>
+                <w:color w:val="263646"/>
+                <w:sz w:val="18"/>
+              </w:rPr>
+              <w:t>源码上传文件</w:t>
+            </w:r>
+          </w:p>
+        </w:tc>
+      </w:tr>
+      <w:tr>
+        <w:tc>
+          <w:tcPr>
+            <w:tcW w:type="dxa" w:w="3099"/>
+            <w:vAlign w:val="center"/>
+            <w:shd w:fill="F4F7FA"/>
+          </w:tcPr>
+          <w:p>
+            <w:r>
+              <w:rPr>
+                <w:rFonts w:ascii="Courier New" w:hAnsi="Courier New" w:eastAsia="Courier New"/>
+                <w:color w:val="12365A"/>
+                <w:sz w:val="17"/>
+              </w:rPr>
+              <w:t>sca-report-data</w:t>
+            </w:r>
+          </w:p>
+        </w:tc>
+        <w:tc>
+          <w:tcPr>
+            <w:tcW w:type="dxa" w:w="3099"/>
+            <w:vAlign w:val="center"/>
+            <w:shd w:fill="F4F7FA"/>
+          </w:tcPr>
+          <w:p>
+            <w:r>
+              <w:rPr>
+                <w:rFonts w:ascii="STHeiti" w:hAnsi="STHeiti" w:eastAsia="STHeiti"/>
+                <w:color w:val="263646"/>
+                <w:sz w:val="18"/>
+              </w:rPr>
+              <w:t>SCA</w:t>
+            </w:r>
+          </w:p>
+        </w:tc>
+        <w:tc>
+          <w:tcPr>
+            <w:tcW w:type="dxa" w:w="3099"/>
+            <w:vAlign w:val="center"/>
+            <w:shd w:fill="F4F7FA"/>
+          </w:tcPr>
+          <w:p>
+            <w:r>
+              <w:rPr>
+                <w:rFonts w:ascii="STHeiti" w:hAnsi="STHeiti" w:eastAsia="STHeiti"/>
+                <w:color w:val="263646"/>
+                <w:sz w:val="18"/>
+              </w:rPr>
+              <w:t>报告文件</w:t>
+            </w:r>
+          </w:p>
+        </w:tc>
+      </w:tr>
+      <w:tr>
+        <w:tc>
+          <w:tcPr>
+            <w:tcW w:type="dxa" w:w="3099"/>
+            <w:vAlign w:val="center"/>
+          </w:tcPr>
+          <w:p>
+            <w:r>
+              <w:rPr>
+                <w:rFonts w:ascii="Courier New" w:hAnsi="Courier New" w:eastAsia="Courier New"/>
+                <w:color w:val="12365A"/>
+                <w:sz w:val="17"/>
+              </w:rPr>
+              <w:t>sca-sbom-data</w:t>
+            </w:r>
+          </w:p>
+        </w:tc>
+        <w:tc>
+          <w:tcPr>
+            <w:tcW w:type="dxa" w:w="3099"/>
+            <w:vAlign w:val="center"/>
+          </w:tcPr>
+          <w:p>
+            <w:r>
+              <w:rPr>
+                <w:rFonts w:ascii="STHeiti" w:hAnsi="STHeiti" w:eastAsia="STHeiti"/>
+                <w:color w:val="263646"/>
+                <w:sz w:val="18"/>
+              </w:rPr>
+              <w:t>SCA</w:t>
+            </w:r>
+          </w:p>
+        </w:tc>
+        <w:tc>
+          <w:tcPr>
+            <w:tcW w:type="dxa" w:w="3099"/>
+            <w:vAlign w:val="center"/>
+          </w:tcPr>
+          <w:p>
+            <w:r>
+              <w:rPr>
+                <w:rFonts w:ascii="STHeiti" w:hAnsi="STHeiti" w:eastAsia="STHeiti"/>
+                <w:color w:val="263646"/>
+                <w:sz w:val="18"/>
+              </w:rPr>
+              <w:t>SBOM 和镜像分析文件</w:t>
+            </w:r>
+          </w:p>
+        </w:tc>
+      </w:tr>
+      <w:tr>
+        <w:tc>
+          <w:tcPr>
+            <w:tcW w:type="dxa" w:w="3099"/>
+            <w:vAlign w:val="center"/>
+            <w:shd w:fill="F4F7FA"/>
+          </w:tcPr>
+          <w:p>
+            <w:r>
+              <w:rPr>
+                <w:rFonts w:ascii="Courier New" w:hAnsi="Courier New" w:eastAsia="Courier New"/>
+                <w:color w:val="12365A"/>
+                <w:sz w:val="17"/>
+              </w:rPr>
+              <w:t>sca-backup-data</w:t>
+            </w:r>
+          </w:p>
+        </w:tc>
+        <w:tc>
+          <w:tcPr>
+            <w:tcW w:type="dxa" w:w="3099"/>
+            <w:vAlign w:val="center"/>
+            <w:shd w:fill="F4F7FA"/>
+          </w:tcPr>
+          <w:p>
+            <w:r>
+              <w:rPr>
+                <w:rFonts w:ascii="STHeiti" w:hAnsi="STHeiti" w:eastAsia="STHeiti"/>
+                <w:color w:val="263646"/>
+                <w:sz w:val="18"/>
+              </w:rPr>
+              <w:t>SCA</w:t>
+            </w:r>
+          </w:p>
+        </w:tc>
+        <w:tc>
+          <w:tcPr>
+            <w:tcW w:type="dxa" w:w="3099"/>
+            <w:vAlign w:val="center"/>
+            <w:shd w:fill="F4F7FA"/>
+          </w:tcPr>
+          <w:p>
+            <w:r>
+              <w:rPr>
+                <w:rFonts w:ascii="STHeiti" w:hAnsi="STHeiti" w:eastAsia="STHeiti"/>
+                <w:color w:val="263646"/>
+                <w:sz w:val="18"/>
+              </w:rPr>
+              <w:t>SCA 备份文件</w:t>
+            </w:r>
+          </w:p>
+        </w:tc>
+      </w:tr>
+      <w:tr>
+        <w:tc>
+          <w:tcPr>
+            <w:tcW w:type="dxa" w:w="3099"/>
+            <w:vAlign w:val="center"/>
+          </w:tcPr>
+          <w:p>
+            <w:r>
+              <w:rPr>
+                <w:rFonts w:ascii="Courier New" w:hAnsi="Courier New" w:eastAsia="Courier New"/>
+                <w:color w:val="12365A"/>
+                <w:sz w:val="17"/>
+              </w:rPr>
+              <w:t>sca-scanner-results</w:t>
+            </w:r>
+          </w:p>
+        </w:tc>
+        <w:tc>
+          <w:tcPr>
+            <w:tcW w:type="dxa" w:w="3099"/>
+            <w:vAlign w:val="center"/>
+          </w:tcPr>
+          <w:p>
+            <w:r>
+              <w:rPr>
+                <w:rFonts w:ascii="STHeiti" w:hAnsi="STHeiti" w:eastAsia="STHeiti"/>
+                <w:color w:val="263646"/>
+                <w:sz w:val="18"/>
+              </w:rPr>
+              <w:t>SCA Scanner Worker</w:t>
+            </w:r>
+          </w:p>
+        </w:tc>
+        <w:tc>
+          <w:tcPr>
+            <w:tcW w:type="dxa" w:w="3099"/>
+            <w:vAlign w:val="center"/>
+          </w:tcPr>
+          <w:p>
+            <w:r>
+              <w:rPr>
+                <w:rFonts w:ascii="STHeiti" w:hAnsi="STHeiti" w:eastAsia="STHeiti"/>
+                <w:color w:val="263646"/>
+                <w:sz w:val="18"/>
+              </w:rPr>
+              <w:t>多引擎扫描原始结果</w:t>
+            </w:r>
+          </w:p>
+        </w:tc>
+      </w:tr>
+      <w:tr>
+        <w:tc>
+          <w:tcPr>
+            <w:tcW w:type="dxa" w:w="3099"/>
+            <w:vAlign w:val="center"/>
+            <w:shd w:fill="F4F7FA"/>
+          </w:tcPr>
+          <w:p>
+            <w:r>
+              <w:rPr>
+                <w:rFonts w:ascii="Courier New" w:hAnsi="Courier New" w:eastAsia="Courier New"/>
+                <w:color w:val="12365A"/>
+                <w:sz w:val="17"/>
+              </w:rPr>
+              <w:t>sca-trivy-cache</w:t>
+            </w:r>
+          </w:p>
+        </w:tc>
+        <w:tc>
+          <w:tcPr>
+            <w:tcW w:type="dxa" w:w="3099"/>
+            <w:vAlign w:val="center"/>
+            <w:shd w:fill="F4F7FA"/>
+          </w:tcPr>
+          <w:p>
+            <w:r>
+              <w:rPr>
+                <w:rFonts w:ascii="STHeiti" w:hAnsi="STHeiti" w:eastAsia="STHeiti"/>
+                <w:color w:val="263646"/>
+                <w:sz w:val="18"/>
+              </w:rPr>
+              <w:t>SCA Scanner Worker</w:t>
+            </w:r>
+          </w:p>
+        </w:tc>
+        <w:tc>
+          <w:tcPr>
+            <w:tcW w:type="dxa" w:w="3099"/>
+            <w:vAlign w:val="center"/>
+            <w:shd w:fill="F4F7FA"/>
+          </w:tcPr>
+          <w:p>
+            <w:r>
+              <w:rPr>
+                <w:rFonts w:ascii="STHeiti" w:hAnsi="STHeiti" w:eastAsia="STHeiti"/>
+                <w:color w:val="263646"/>
+                <w:sz w:val="18"/>
+              </w:rPr>
+              <w:t>Trivy 缓存</w:t>
+            </w:r>
+          </w:p>
+        </w:tc>
+      </w:tr>
+      <w:tr>
+        <w:tc>
+          <w:tcPr>
+            <w:tcW w:type="dxa" w:w="3099"/>
+            <w:vAlign w:val="center"/>
+          </w:tcPr>
+          <w:p>
+            <w:r>
+              <w:rPr>
+                <w:rFonts w:ascii="Courier New" w:hAnsi="Courier New" w:eastAsia="Courier New"/>
+                <w:color w:val="12365A"/>
+                <w:sz w:val="17"/>
+              </w:rPr>
+              <w:t>dependency-track-data</w:t>
+            </w:r>
+          </w:p>
+        </w:tc>
+        <w:tc>
+          <w:tcPr>
+            <w:tcW w:type="dxa" w:w="3099"/>
+            <w:vAlign w:val="center"/>
+          </w:tcPr>
+          <w:p>
+            <w:r>
+              <w:rPr>
+                <w:rFonts w:ascii="STHeiti" w:hAnsi="STHeiti" w:eastAsia="STHeiti"/>
+                <w:color w:val="263646"/>
+                <w:sz w:val="18"/>
+              </w:rPr>
+              <w:t>Dependency-Track</w:t>
+            </w:r>
+          </w:p>
+        </w:tc>
+        <w:tc>
+          <w:tcPr>
+            <w:tcW w:type="dxa" w:w="3099"/>
+            <w:vAlign w:val="center"/>
+          </w:tcPr>
+          <w:p>
+            <w:r>
+              <w:rPr>
+                <w:rFonts w:ascii="STHeiti" w:hAnsi="STHeiti" w:eastAsia="STHeiti"/>
+                <w:color w:val="263646"/>
+                <w:sz w:val="18"/>
+              </w:rPr>
+              <w:t>Dependency-Track 应用数据</w:t>
+            </w:r>
+          </w:p>
+        </w:tc>
+      </w:tr>
+    </w:tbl>
+    <w:p/>
+    <w:p>
+      <w:r>
+        <w:rPr>
+          <w:rFonts w:ascii="STHeiti" w:hAnsi="STHeiti" w:eastAsia="STHeiti"/>
+          <w:color w:val="263646"/>
+          <w:sz w:val="21"/>
+        </w:rPr>
+        <w:t>备份设计必须覆盖数据库和文件卷两类对象。只备份 MySQL 会导致 FAQ、Tender、Train Exam、SCA 的文件型数据无法完整恢复。</w:t>
+      </w:r>
+    </w:p>
+    <w:p>
+      <w:pPr>
+        <w:pStyle w:val="Heading3"/>
+      </w:pPr>
+      <w:r>
+        <w:t>9.6 启动依赖与健康检查</w:t>
+      </w:r>
+    </w:p>
+    <w:p>
+      <w:r>
+        <w:rPr>
+          <w:rFonts w:ascii="STHeiti" w:hAnsi="STHeiti" w:eastAsia="STHeiti"/>
+          <w:color w:val="263646"/>
+          <w:sz w:val="21"/>
+        </w:rPr>
+        <w:t xml:space="preserve">Compose 当前通过 </w:t>
+      </w:r>
+      <w:r>
+        <w:rPr>
+          <w:rFonts w:ascii="Courier New" w:hAnsi="Courier New" w:eastAsia="Courier New"/>
+          <w:color w:val="12365A"/>
+          <w:sz w:val="20"/>
+        </w:rPr>
+        <w:t>depends_on</w:t>
+      </w:r>
+      <w:r>
+        <w:rPr>
+          <w:rFonts w:ascii="STHeiti" w:hAnsi="STHeiti" w:eastAsia="STHeiti"/>
+          <w:color w:val="263646"/>
+          <w:sz w:val="21"/>
+        </w:rPr>
+        <w:t xml:space="preserve"> 描述主要启动依赖：</w:t>
+      </w:r>
+    </w:p>
+    <w:p>
+      <w:pPr>
+        <w:pStyle w:val="ListBullet"/>
+        <w:ind w:left="397"/>
+      </w:pPr>
+      <w:r>
+        <w:rPr>
+          <w:rFonts w:ascii="STHeiti" w:hAnsi="STHeiti" w:eastAsia="STHeiti"/>
+          <w:color w:val="263646"/>
+          <w:sz w:val="21"/>
+        </w:rPr>
+        <w:t xml:space="preserve">大多数业务 API 依赖 </w:t>
+      </w:r>
+      <w:r>
+        <w:rPr>
+          <w:rFonts w:ascii="Courier New" w:hAnsi="Courier New" w:eastAsia="Courier New"/>
+          <w:color w:val="12365A"/>
+          <w:sz w:val="20"/>
+        </w:rPr>
+        <w:t>mysql</w:t>
+      </w:r>
+      <w:r>
+        <w:rPr>
+          <w:rFonts w:ascii="STHeiti" w:hAnsi="STHeiti" w:eastAsia="STHeiti"/>
+          <w:color w:val="263646"/>
+          <w:sz w:val="21"/>
+        </w:rPr>
+        <w:t xml:space="preserve"> 和 </w:t>
+      </w:r>
+      <w:r>
+        <w:rPr>
+          <w:rFonts w:ascii="Courier New" w:hAnsi="Courier New" w:eastAsia="Courier New"/>
+          <w:color w:val="12365A"/>
+          <w:sz w:val="20"/>
+        </w:rPr>
+        <w:t>auth</w:t>
+      </w:r>
+      <w:r>
+        <w:rPr>
+          <w:rFonts w:ascii="STHeiti" w:hAnsi="STHeiti" w:eastAsia="STHeiti"/>
+          <w:color w:val="263646"/>
+          <w:sz w:val="21"/>
+        </w:rPr>
+        <w:t>。</w:t>
+      </w:r>
+    </w:p>
+    <w:p>
+      <w:pPr>
+        <w:pStyle w:val="ListBullet"/>
+        <w:ind w:left="397"/>
+      </w:pPr>
+      <w:r>
+        <w:rPr>
+          <w:rFonts w:ascii="STHeiti" w:hAnsi="STHeiti" w:eastAsia="STHeiti"/>
+          <w:color w:val="263646"/>
+          <w:sz w:val="21"/>
+        </w:rPr>
+        <w:t xml:space="preserve">FAQ/Tender 依赖 </w:t>
+      </w:r>
+      <w:r>
+        <w:rPr>
+          <w:rFonts w:ascii="Courier New" w:hAnsi="Courier New" w:eastAsia="Courier New"/>
+          <w:color w:val="12365A"/>
+          <w:sz w:val="20"/>
+        </w:rPr>
+        <w:t>onlyoffice</w:t>
+      </w:r>
+      <w:r>
+        <w:rPr>
+          <w:rFonts w:ascii="STHeiti" w:hAnsi="STHeiti" w:eastAsia="STHeiti"/>
+          <w:color w:val="263646"/>
+          <w:sz w:val="21"/>
+        </w:rPr>
+        <w:t>。</w:t>
+      </w:r>
+    </w:p>
+    <w:p>
+      <w:pPr>
+        <w:pStyle w:val="ListBullet"/>
+        <w:ind w:left="397"/>
+      </w:pPr>
+      <w:r>
+        <w:rPr>
+          <w:rFonts w:ascii="STHeiti" w:hAnsi="STHeiti" w:eastAsia="STHeiti"/>
+          <w:color w:val="263646"/>
+          <w:sz w:val="21"/>
+        </w:rPr>
+        <w:t xml:space="preserve">Train Exam 依赖 </w:t>
+      </w:r>
+      <w:r>
+        <w:rPr>
+          <w:rFonts w:ascii="Courier New" w:hAnsi="Courier New" w:eastAsia="Courier New"/>
+          <w:color w:val="12365A"/>
+          <w:sz w:val="20"/>
+        </w:rPr>
+        <w:t>train-exam-onlyoffice</w:t>
+      </w:r>
+      <w:r>
+        <w:rPr>
+          <w:rFonts w:ascii="STHeiti" w:hAnsi="STHeiti" w:eastAsia="STHeiti"/>
+          <w:color w:val="263646"/>
+          <w:sz w:val="21"/>
+        </w:rPr>
+        <w:t>。</w:t>
+      </w:r>
+    </w:p>
+    <w:p>
+      <w:pPr>
+        <w:pStyle w:val="ListBullet"/>
+        <w:ind w:left="397"/>
+      </w:pPr>
+      <w:r>
+        <w:rPr>
+          <w:rFonts w:ascii="STHeiti" w:hAnsi="STHeiti" w:eastAsia="STHeiti"/>
+          <w:color w:val="263646"/>
+          <w:sz w:val="21"/>
+        </w:rPr>
+        <w:t xml:space="preserve">SCA API/Worker/Beat 依赖 </w:t>
+      </w:r>
+      <w:r>
+        <w:rPr>
+          <w:rFonts w:ascii="Courier New" w:hAnsi="Courier New" w:eastAsia="Courier New"/>
+          <w:color w:val="12365A"/>
+          <w:sz w:val="20"/>
+        </w:rPr>
+        <w:t>sca-postgres</w:t>
+      </w:r>
+      <w:r>
+        <w:rPr>
+          <w:rFonts w:ascii="STHeiti" w:hAnsi="STHeiti" w:eastAsia="STHeiti"/>
+          <w:color w:val="263646"/>
+          <w:sz w:val="21"/>
+        </w:rPr>
+        <w:t xml:space="preserve"> 和 </w:t>
+      </w:r>
+      <w:r>
+        <w:rPr>
+          <w:rFonts w:ascii="Courier New" w:hAnsi="Courier New" w:eastAsia="Courier New"/>
+          <w:color w:val="12365A"/>
+          <w:sz w:val="20"/>
+        </w:rPr>
+        <w:t>sca-redis</w:t>
+      </w:r>
+      <w:r>
+        <w:rPr>
+          <w:rFonts w:ascii="STHeiti" w:hAnsi="STHeiti" w:eastAsia="STHeiti"/>
+          <w:color w:val="263646"/>
+          <w:sz w:val="21"/>
+        </w:rPr>
+        <w:t xml:space="preserve"> 健康检查。</w:t>
+      </w:r>
+    </w:p>
+    <w:p>
+      <w:pPr>
+        <w:pStyle w:val="ListBullet"/>
+        <w:ind w:left="397"/>
+      </w:pPr>
+      <w:r>
+        <w:rPr>
+          <w:rFonts w:ascii="STHeiti" w:hAnsi="STHeiti" w:eastAsia="STHeiti"/>
+          <w:color w:val="263646"/>
+          <w:sz w:val="21"/>
+        </w:rPr>
+        <w:t xml:space="preserve">Big Screen 依赖 </w:t>
+      </w:r>
+      <w:r>
+        <w:rPr>
+          <w:rFonts w:ascii="Courier New" w:hAnsi="Courier New" w:eastAsia="Courier New"/>
+          <w:color w:val="12365A"/>
+          <w:sz w:val="20"/>
+        </w:rPr>
+        <w:t>mysql</w:t>
+      </w:r>
+      <w:r>
+        <w:rPr>
+          <w:rFonts w:ascii="STHeiti" w:hAnsi="STHeiti" w:eastAsia="STHeiti"/>
+          <w:color w:val="263646"/>
+          <w:sz w:val="21"/>
+        </w:rPr>
+        <w:t>、</w:t>
+      </w:r>
+      <w:r>
+        <w:rPr>
+          <w:rFonts w:ascii="Courier New" w:hAnsi="Courier New" w:eastAsia="Courier New"/>
+          <w:color w:val="12365A"/>
+          <w:sz w:val="20"/>
+        </w:rPr>
+        <w:t>auth</w:t>
+      </w:r>
+      <w:r>
+        <w:rPr>
+          <w:rFonts w:ascii="STHeiti" w:hAnsi="STHeiti" w:eastAsia="STHeiti"/>
+          <w:color w:val="263646"/>
+          <w:sz w:val="21"/>
+        </w:rPr>
+        <w:t>、</w:t>
+      </w:r>
+      <w:r>
+        <w:rPr>
+          <w:rFonts w:ascii="Courier New" w:hAnsi="Courier New" w:eastAsia="Courier New"/>
+          <w:color w:val="12365A"/>
+          <w:sz w:val="20"/>
+        </w:rPr>
+        <w:t>api</w:t>
+      </w:r>
+      <w:r>
+        <w:rPr>
+          <w:rFonts w:ascii="STHeiti" w:hAnsi="STHeiti" w:eastAsia="STHeiti"/>
+          <w:color w:val="263646"/>
+          <w:sz w:val="21"/>
+        </w:rPr>
+        <w:t>、</w:t>
+      </w:r>
+      <w:r>
+        <w:rPr>
+          <w:rFonts w:ascii="Courier New" w:hAnsi="Courier New" w:eastAsia="Courier New"/>
+          <w:color w:val="12365A"/>
+          <w:sz w:val="20"/>
+        </w:rPr>
+        <w:t>train-exam-api</w:t>
+      </w:r>
+      <w:r>
+        <w:rPr>
+          <w:rFonts w:ascii="STHeiti" w:hAnsi="STHeiti" w:eastAsia="STHeiti"/>
+          <w:color w:val="263646"/>
+          <w:sz w:val="21"/>
+        </w:rPr>
+        <w:t xml:space="preserve"> 和 </w:t>
+      </w:r>
+      <w:r>
+        <w:rPr>
+          <w:rFonts w:ascii="Courier New" w:hAnsi="Courier New" w:eastAsia="Courier New"/>
+          <w:color w:val="12365A"/>
+          <w:sz w:val="20"/>
+        </w:rPr>
+        <w:t>sca-api</w:t>
+      </w:r>
+      <w:r>
+        <w:rPr>
+          <w:rFonts w:ascii="STHeiti" w:hAnsi="STHeiti" w:eastAsia="STHeiti"/>
+          <w:color w:val="263646"/>
+          <w:sz w:val="21"/>
+        </w:rPr>
+        <w:t>。</w:t>
+      </w:r>
+    </w:p>
+    <w:p>
+      <w:pPr>
+        <w:pStyle w:val="ListBullet"/>
+        <w:ind w:left="397"/>
+      </w:pPr>
+      <w:r>
+        <w:rPr>
+          <w:rFonts w:ascii="STHeiti" w:hAnsi="STHeiti" w:eastAsia="STHeiti"/>
+          <w:color w:val="263646"/>
+          <w:sz w:val="21"/>
+        </w:rPr>
+        <w:t xml:space="preserve">CMDB 依赖一次性任务 </w:t>
+      </w:r>
+      <w:r>
+        <w:rPr>
+          <w:rFonts w:ascii="Courier New" w:hAnsi="Courier New" w:eastAsia="Courier New"/>
+          <w:color w:val="12365A"/>
+          <w:sz w:val="20"/>
+        </w:rPr>
+        <w:t>cmdb-mysql-init</w:t>
+      </w:r>
+      <w:r>
+        <w:rPr>
+          <w:rFonts w:ascii="STHeiti" w:hAnsi="STHeiti" w:eastAsia="STHeiti"/>
+          <w:color w:val="263646"/>
+          <w:sz w:val="21"/>
+        </w:rPr>
+        <w:t xml:space="preserve"> 完成数据库初始化。</w:t>
+      </w:r>
+    </w:p>
+    <w:p>
+      <w:r>
+        <w:rPr>
+          <w:rFonts w:ascii="STHeiti" w:hAnsi="STHeiti" w:eastAsia="STHeiti"/>
+          <w:color w:val="263646"/>
+          <w:sz w:val="21"/>
+        </w:rPr>
+        <w:t>需要注意：</w:t>
+      </w:r>
+    </w:p>
+    <w:p>
+      <w:pPr>
+        <w:pStyle w:val="ListBullet"/>
+        <w:ind w:left="397"/>
+      </w:pPr>
+      <w:r>
+        <w:rPr>
+          <w:rFonts w:ascii="Courier New" w:hAnsi="Courier New" w:eastAsia="Courier New"/>
+          <w:color w:val="12365A"/>
+          <w:sz w:val="20"/>
+        </w:rPr>
+        <w:t>depends_on</w:t>
+      </w:r>
+      <w:r>
+        <w:rPr>
+          <w:rFonts w:ascii="STHeiti" w:hAnsi="STHeiti" w:eastAsia="STHeiti"/>
+          <w:color w:val="263646"/>
+          <w:sz w:val="21"/>
+        </w:rPr>
+        <w:t xml:space="preserve"> 只能保证容器启动顺序，不能替代业务就绪检查。</w:t>
+      </w:r>
+    </w:p>
+    <w:p>
+      <w:pPr>
+        <w:pStyle w:val="ListBullet"/>
+        <w:ind w:left="397"/>
+      </w:pPr>
+      <w:r>
+        <w:rPr>
+          <w:rFonts w:ascii="STHeiti" w:hAnsi="STHeiti" w:eastAsia="STHeiti"/>
+          <w:color w:val="263646"/>
+          <w:sz w:val="21"/>
+        </w:rPr>
+        <w:t>SCA 的 PostgreSQL 和 Redis 已配置容器级健康检查，是当前较完整的就绪依赖样板。</w:t>
+      </w:r>
+    </w:p>
+    <w:p>
+      <w:pPr>
+        <w:pStyle w:val="ListBullet"/>
+        <w:ind w:left="397"/>
+      </w:pPr>
+      <w:r>
+        <w:rPr>
+          <w:rFonts w:ascii="STHeiti" w:hAnsi="STHeiti" w:eastAsia="STHeiti"/>
+          <w:color w:val="263646"/>
+          <w:sz w:val="21"/>
+        </w:rPr>
+        <w:t xml:space="preserve">其他系统仍需要补充应用级 </w:t>
+      </w:r>
+      <w:r>
+        <w:rPr>
+          <w:rFonts w:ascii="Courier New" w:hAnsi="Courier New" w:eastAsia="Courier New"/>
+          <w:color w:val="12365A"/>
+          <w:sz w:val="20"/>
+        </w:rPr>
+        <w:t>/health</w:t>
+      </w:r>
+      <w:r>
+        <w:rPr>
+          <w:rFonts w:ascii="STHeiti" w:hAnsi="STHeiti" w:eastAsia="STHeiti"/>
+          <w:color w:val="263646"/>
+          <w:sz w:val="21"/>
+        </w:rPr>
+        <w:t xml:space="preserve"> 或 </w:t>
+      </w:r>
+      <w:r>
+        <w:rPr>
+          <w:rFonts w:ascii="Courier New" w:hAnsi="Courier New" w:eastAsia="Courier New"/>
+          <w:color w:val="12365A"/>
+          <w:sz w:val="20"/>
+        </w:rPr>
+        <w:t>/ready</w:t>
+      </w:r>
+      <w:r>
+        <w:rPr>
+          <w:rFonts w:ascii="STHeiti" w:hAnsi="STHeiti" w:eastAsia="STHeiti"/>
+          <w:color w:val="263646"/>
+          <w:sz w:val="21"/>
+        </w:rPr>
+        <w:t xml:space="preserve"> 检查，并纳入发布验证脚本。</w:t>
+      </w:r>
+    </w:p>
+    <w:p>
+      <w:pPr>
+        <w:pStyle w:val="ListBullet"/>
+        <w:ind w:left="397"/>
+      </w:pPr>
+      <w:r>
+        <w:rPr>
+          <w:rFonts w:ascii="STHeiti" w:hAnsi="STHeiti" w:eastAsia="STHeiti"/>
+          <w:color w:val="263646"/>
+          <w:sz w:val="21"/>
+        </w:rPr>
+        <w:t>初始化任务和业务迁移应保持幂等，避免容器重启后重复写入脏数据。</w:t>
+      </w:r>
+    </w:p>
+    <w:p>
+      <w:pPr>
+        <w:pStyle w:val="Heading3"/>
+      </w:pPr>
+      <w:r>
+        <w:t>9.7 Docker 运维命令基线</w:t>
+      </w:r>
+    </w:p>
+    <w:p>
+      <w:r>
+        <w:rPr>
+          <w:rFonts w:ascii="STHeiti" w:hAnsi="STHeiti" w:eastAsia="STHeiti"/>
+          <w:color w:val="263646"/>
+          <w:sz w:val="21"/>
+        </w:rPr>
+        <w:t>日常运维建议统一使用仓库脚本，而不是手写长命令：</w:t>
+      </w:r>
+    </w:p>
+    <w:p>
+      <w:pPr>
+        <w:pStyle w:val="CodeBlock"/>
+        <w:shd w:fill="F2F4F7"/>
+      </w:pPr>
+      <w:r>
+        <w:rPr>
+          <w:rFonts w:ascii="Courier New" w:hAnsi="Courier New" w:eastAsia="Courier New"/>
+          <w:color w:val="263646"/>
+          <w:sz w:val="17"/>
+        </w:rPr>
+        <w:t># 启动已有镜像，适合日常验证</w:t>
+        <w:br/>
+        <w:t>./scripts/deploy/docker-compose-aliyun.sh start</w:t>
+        <w:br/>
+        <w:br/>
+        <w:t># 代码、Dockerfile 或依赖变更后重建</w:t>
+        <w:br/>
+        <w:t>./scripts/deploy/docker-compose-aliyun.sh rebuild</w:t>
+        <w:br/>
+        <w:br/>
+        <w:t># 只验证某个系统，可追加服务名</w:t>
+        <w:br/>
+        <w:t>./scripts/deploy/docker-compose-aliyun.sh start mysql auth sca-postgres sca-redis sca-api web-sca</w:t>
+        <w:br/>
+        <w:br/>
+        <w:t># 查看容器状态和日志</w:t>
+        <w:br/>
+        <w:t>docker compose ps</w:t>
+        <w:br/>
+        <w:t>docker compose logs -f auth sca-api web-sca</w:t>
+      </w:r>
+    </w:p>
+    <w:p>
+      <w:r>
+        <w:rPr>
+          <w:rFonts w:ascii="STHeiti" w:hAnsi="STHeiti" w:eastAsia="STHeiti"/>
+          <w:color w:val="263646"/>
+          <w:sz w:val="21"/>
+        </w:rPr>
+        <w:t>建议形成标准发布步骤：</w:t>
+      </w:r>
+    </w:p>
+    <w:p>
+      <w:pPr>
+        <w:pStyle w:val="ListNumber"/>
+        <w:ind w:left="397"/>
+      </w:pPr>
+      <w:r>
+        <w:rPr>
+          <w:rFonts w:ascii="STHeiti" w:hAnsi="STHeiti" w:eastAsia="STHeiti"/>
+          <w:color w:val="263646"/>
+          <w:sz w:val="21"/>
+        </w:rPr>
+        <w:t xml:space="preserve">校验 </w:t>
+      </w:r>
+      <w:r>
+        <w:rPr>
+          <w:rFonts w:ascii="Courier New" w:hAnsi="Courier New" w:eastAsia="Courier New"/>
+          <w:color w:val="12365A"/>
+          <w:sz w:val="20"/>
+        </w:rPr>
+        <w:t>.env</w:t>
+      </w:r>
+      <w:r>
+        <w:rPr>
+          <w:rFonts w:ascii="STHeiti" w:hAnsi="STHeiti" w:eastAsia="STHeiti"/>
+          <w:color w:val="263646"/>
+          <w:sz w:val="21"/>
+        </w:rPr>
+        <w:t xml:space="preserve"> 必填项。</w:t>
+      </w:r>
+    </w:p>
+    <w:p>
+      <w:pPr>
+        <w:pStyle w:val="ListNumber"/>
+        <w:ind w:left="397"/>
+      </w:pPr>
+      <w:r>
+        <w:rPr>
+          <w:rFonts w:ascii="STHeiti" w:hAnsi="STHeiti" w:eastAsia="STHeiti"/>
+          <w:color w:val="263646"/>
+          <w:sz w:val="21"/>
+        </w:rPr>
+        <w:t>拉取代码和目标分支。</w:t>
+      </w:r>
+    </w:p>
+    <w:p>
+      <w:pPr>
+        <w:pStyle w:val="ListNumber"/>
+        <w:ind w:left="397"/>
+      </w:pPr>
+      <w:r>
+        <w:rPr>
+          <w:rFonts w:ascii="STHeiti" w:hAnsi="STHeiti" w:eastAsia="STHeiti"/>
+          <w:color w:val="263646"/>
+          <w:sz w:val="21"/>
+        </w:rPr>
+        <w:t>执行最快相关测试。</w:t>
+      </w:r>
+    </w:p>
+    <w:p>
+      <w:pPr>
+        <w:pStyle w:val="ListNumber"/>
+        <w:ind w:left="397"/>
+      </w:pPr>
+      <w:r>
+        <w:rPr>
+          <w:rFonts w:ascii="STHeiti" w:hAnsi="STHeiti" w:eastAsia="STHeiti"/>
+          <w:color w:val="263646"/>
+          <w:sz w:val="21"/>
+        </w:rPr>
+        <w:t>重建受影响服务。</w:t>
+      </w:r>
+    </w:p>
+    <w:p>
+      <w:pPr>
+        <w:pStyle w:val="ListNumber"/>
+        <w:ind w:left="397"/>
+      </w:pPr>
+      <w:r>
+        <w:rPr>
+          <w:rFonts w:ascii="STHeiti" w:hAnsi="STHeiti" w:eastAsia="STHeiti"/>
+          <w:color w:val="263646"/>
+          <w:sz w:val="21"/>
+        </w:rPr>
+        <w:t>启动服务并检查健康接口。</w:t>
+      </w:r>
+    </w:p>
+    <w:p>
+      <w:pPr>
+        <w:pStyle w:val="ListNumber"/>
+        <w:ind w:left="397"/>
+      </w:pPr>
+      <w:r>
+        <w:rPr>
+          <w:rFonts w:ascii="STHeiti" w:hAnsi="STHeiti" w:eastAsia="STHeiti"/>
+          <w:color w:val="263646"/>
+          <w:sz w:val="21"/>
+        </w:rPr>
+        <w:t>验证门户、系统切换、退出登录和目标业务主流程。</w:t>
+      </w:r>
+    </w:p>
+    <w:p>
+      <w:pPr>
+        <w:pStyle w:val="ListNumber"/>
+        <w:ind w:left="397"/>
+      </w:pPr>
+      <w:r>
+        <w:rPr>
+          <w:rFonts w:ascii="STHeiti" w:hAnsi="STHeiti" w:eastAsia="STHeiti"/>
+          <w:color w:val="263646"/>
+          <w:sz w:val="21"/>
+        </w:rPr>
+        <w:t>记录版本号、镜像标签、提交号和回退点。</w:t>
+      </w:r>
+    </w:p>
+    <w:p>
+      <w:pPr>
+        <w:pStyle w:val="Heading3"/>
+      </w:pPr>
+      <w:r>
+        <w:t>9.8 配置与密钥</w:t>
+      </w:r>
+    </w:p>
+    <w:p>
+      <w:pPr>
+        <w:pStyle w:val="ListBullet"/>
+        <w:ind w:left="397"/>
+      </w:pPr>
+      <w:r>
+        <w:rPr>
+          <w:rFonts w:ascii="Courier New" w:hAnsi="Courier New" w:eastAsia="Courier New"/>
+          <w:color w:val="12365A"/>
+          <w:sz w:val="20"/>
+        </w:rPr>
+        <w:t>.env.example</w:t>
+      </w:r>
+      <w:r>
+        <w:rPr>
+          <w:rFonts w:ascii="STHeiti" w:hAnsi="STHeiti" w:eastAsia="STHeiti"/>
+          <w:color w:val="263646"/>
+          <w:sz w:val="21"/>
+        </w:rPr>
+        <w:t xml:space="preserve"> 只提供变量结构，真实密码和密钥必须由部署环境提供。</w:t>
+      </w:r>
+    </w:p>
+    <w:p>
+      <w:pPr>
+        <w:pStyle w:val="ListBullet"/>
+        <w:ind w:left="397"/>
+      </w:pPr>
+      <w:r>
+        <w:rPr>
+          <w:rFonts w:ascii="STHeiti" w:hAnsi="STHeiti" w:eastAsia="STHeiti"/>
+          <w:color w:val="263646"/>
+          <w:sz w:val="21"/>
+        </w:rPr>
+        <w:t>数据库密码、JWT 密钥、审计签名密钥、文档密钥和第三方令牌不得提交到 Git。</w:t>
+      </w:r>
+    </w:p>
+    <w:p>
+      <w:pPr>
+        <w:pStyle w:val="ListBullet"/>
+        <w:ind w:left="397"/>
+      </w:pPr>
+      <w:r>
+        <w:rPr>
+          <w:rFonts w:ascii="STHeiti" w:hAnsi="STHeiti" w:eastAsia="STHeiti"/>
+          <w:color w:val="263646"/>
+          <w:sz w:val="21"/>
+        </w:rPr>
+        <w:t>生产环境应启用 HTTPS、安全 Cookie 和严格安全模式。</w:t>
+      </w:r>
+    </w:p>
+    <w:p>
+      <w:pPr>
+        <w:pStyle w:val="ListBullet"/>
+        <w:ind w:left="397"/>
+      </w:pPr>
+      <w:r>
+        <w:rPr>
+          <w:rFonts w:ascii="STHeiti" w:hAnsi="STHeiti" w:eastAsia="STHeiti"/>
+          <w:color w:val="263646"/>
+          <w:sz w:val="21"/>
+        </w:rPr>
+        <w:t>CORS 只允许实际使用的门户和业务域名。</w:t>
+      </w:r>
+    </w:p>
+    <w:p>
+      <w:pPr>
+        <w:pStyle w:val="ListBullet"/>
+        <w:ind w:left="397"/>
+      </w:pPr>
+      <w:r>
+        <w:rPr>
+          <w:rFonts w:ascii="STHeiti" w:hAnsi="STHeiti" w:eastAsia="STHeiti"/>
+          <w:color w:val="263646"/>
+          <w:sz w:val="21"/>
+        </w:rPr>
         <w:t>业务容器不应以数据库 root 账号运行。</w:t>
       </w:r>
     </w:p>
@@ -8186,7 +11235,7 @@
         <w:pStyle w:val="Heading3"/>
       </w:pPr>
       <w:r>
-        <w:t>9.3 启停与健康检查</w:t>
+        <w:t>9.9 启停与健康检查</w:t>
       </w:r>
     </w:p>
     <w:p>
@@ -11844,7 +14893,7 @@
         <w:color w:val="667788"/>
         <w:sz w:val="17"/>
       </w:rPr>
-      <w:t>聚信多系统业务平台高层设计  |  v5.70.15</w:t>
+      <w:t>聚信多系统业务平台高层设计  |  v5.70.16</w:t>
     </w:r>
   </w:p>
 </w:hdr>

</xml_diff>

<commit_message>
[v5.70.17] docs(architecture): improve container overview diagram
</commit_message>
<xml_diff>
--- a/outputs/all-systems-hld/聚信多系统业务平台高层设计.docx
+++ b/outputs/all-systems-hld/聚信多系统业务平台高层设计.docx
@@ -85,7 +85,7 @@
           <w:color w:val="263646"/>
           <w:sz w:val="23"/>
         </w:rPr>
-        <w:t>适用版本：5.70.16 及后续兼容版本</w:t>
+        <w:t>适用版本：5.70.17 及后续兼容版本</w:t>
       </w:r>
     </w:p>
     <w:p>
@@ -1047,7 +1047,7 @@
         <w:pStyle w:val="Heading3"/>
       </w:pPr>
       <w:r>
-        <w:t>3.1 逻辑分层</w:t>
+        <w:t>3.1 容器化总体分层</w:t>
       </w:r>
     </w:p>
     <w:p>
@@ -1100,7 +1100,7 @@
           <w:color w:val="667788"/>
           <w:sz w:val="18"/>
         </w:rPr>
-        <w:t>图 1  平台总体架构</w:t>
+        <w:t>图 1  平台总体架构（含容器）</w:t>
       </w:r>
     </w:p>
     <w:p>
@@ -14893,7 +14893,7 @@
         <w:color w:val="667788"/>
         <w:sz w:val="17"/>
       </w:rPr>
-      <w:t>聚信多系统业务平台高层设计  |  v5.70.16</w:t>
+      <w:t>聚信多系统业务平台高层设计  |  v5.70.17</w:t>
     </w:r>
   </w:p>
 </w:hdr>

</xml_diff>

<commit_message>
[v5.70.18] docs(architecture): localize architecture diagrams
</commit_message>
<xml_diff>
--- a/outputs/all-systems-hld/聚信多系统业务平台高层设计.docx
+++ b/outputs/all-systems-hld/聚信多系统业务平台高层设计.docx
@@ -85,7 +85,7 @@
           <w:color w:val="263646"/>
           <w:sz w:val="23"/>
         </w:rPr>
-        <w:t>适用版本：5.70.17 及后续兼容版本</w:t>
+        <w:t>适用版本：5.70.18 及后续兼容版本</w:t>
       </w:r>
     </w:p>
     <w:p>
@@ -7596,7 +7596,7 @@
           <w:color w:val="667788"/>
           <w:sz w:val="18"/>
         </w:rPr>
-        <w:t>图 4  统一认证与系统访问流程</w:t>
+        <w:t>图 3  统一认证与系统访问流程</w:t>
       </w:r>
     </w:p>
     <w:p>
@@ -7940,7 +7940,7 @@
           <w:color w:val="667788"/>
           <w:sz w:val="18"/>
         </w:rPr>
-        <w:t>图 3  当前 Docker Compose 部署关系</w:t>
+        <w:t>图 4  当前 Docker Compose 部署关系</w:t>
       </w:r>
     </w:p>
     <w:p>
@@ -14893,7 +14893,7 @@
         <w:color w:val="667788"/>
         <w:sz w:val="17"/>
       </w:rPr>
-      <w:t>聚信多系统业务平台高层设计  |  v5.70.17</w:t>
+      <w:t>聚信多系统业务平台高层设计  |  v5.70.18</w:t>
     </w:r>
   </w:p>
 </w:hdr>

</xml_diff>

<commit_message>
[v5.73.0] feat(docs): refine observability metrics design
</commit_message>
<xml_diff>
--- a/outputs/all-systems-hld/聚信多系统业务平台高层设计.docx
+++ b/outputs/all-systems-hld/聚信多系统业务平台高层设计.docx
@@ -12934,97 +12934,406 @@
       </w:r>
     </w:p>
     <w:p>
-      <w:pPr>
-        <w:pStyle w:val="ListBullet"/>
-        <w:ind w:left="397"/>
-      </w:pPr>
-      <w:r>
-        <w:rPr>
-          <w:rFonts w:ascii="STHeiti" w:hAnsi="STHeiti" w:eastAsia="STHeiti"/>
-          <w:color w:val="263646"/>
-          <w:sz w:val="21"/>
-        </w:rPr>
-        <w:t>HTTP 请求量、错误率和延迟。</w:t>
-      </w:r>
-    </w:p>
-    <w:p>
-      <w:pPr>
-        <w:pStyle w:val="ListBullet"/>
-        <w:ind w:left="397"/>
-      </w:pPr>
-      <w:r>
-        <w:rPr>
-          <w:rFonts w:ascii="STHeiti" w:hAnsi="STHeiti" w:eastAsia="STHeiti"/>
-          <w:color w:val="263646"/>
-          <w:sz w:val="21"/>
-        </w:rPr>
-        <w:t>Auth 登录成功率、失败原因、会话数和鉴权延迟。</w:t>
-      </w:r>
-    </w:p>
-    <w:p>
-      <w:pPr>
-        <w:pStyle w:val="ListBullet"/>
-        <w:ind w:left="397"/>
-      </w:pPr>
-      <w:r>
-        <w:rPr>
-          <w:rFonts w:ascii="STHeiti" w:hAnsi="STHeiti" w:eastAsia="STHeiti"/>
-          <w:color w:val="263646"/>
-          <w:sz w:val="21"/>
-        </w:rPr>
-        <w:t>数据库连接池、慢查询、容量和备份状态。</w:t>
-      </w:r>
-    </w:p>
-    <w:p>
-      <w:pPr>
-        <w:pStyle w:val="ListBullet"/>
-        <w:ind w:left="397"/>
-      </w:pPr>
-      <w:r>
-        <w:rPr>
-          <w:rFonts w:ascii="STHeiti" w:hAnsi="STHeiti" w:eastAsia="STHeiti"/>
-          <w:color w:val="263646"/>
-          <w:sz w:val="21"/>
-        </w:rPr>
-        <w:t>Worker 队列长度、任务耗时、失败率和重试次数。</w:t>
-      </w:r>
-    </w:p>
-    <w:p>
-      <w:pPr>
-        <w:pStyle w:val="ListBullet"/>
-        <w:ind w:left="397"/>
-      </w:pPr>
-      <w:r>
-        <w:rPr>
-          <w:rFonts w:ascii="STHeiti" w:hAnsi="STHeiti" w:eastAsia="STHeiti"/>
-          <w:color w:val="263646"/>
-          <w:sz w:val="21"/>
-        </w:rPr>
-        <w:t>文件卷容量、增长率和孤儿文件数量。</w:t>
-      </w:r>
-    </w:p>
-    <w:p>
-      <w:pPr>
-        <w:pStyle w:val="ListBullet"/>
-        <w:ind w:left="397"/>
-      </w:pPr>
-      <w:r>
-        <w:rPr>
-          <w:rFonts w:ascii="STHeiti" w:hAnsi="STHeiti" w:eastAsia="STHeiti"/>
-          <w:color w:val="263646"/>
-          <w:sz w:val="21"/>
-        </w:rPr>
-        <w:t>外部依赖成功率、超时率和熔断状态。</w:t>
-      </w:r>
-    </w:p>
-    <w:p>
-      <w:r>
-        <w:rPr>
-          <w:rFonts w:ascii="STHeiti" w:hAnsi="STHeiti" w:eastAsia="STHeiti"/>
-          <w:color w:val="263646"/>
-          <w:sz w:val="21"/>
-        </w:rPr>
-        <w:t xml:space="preserve">建议后续引入统一结构化日志、指标采集和分布式追踪，并为每个请求贯穿 </w:t>
+      <w:r>
+        <w:rPr>
+          <w:rFonts w:ascii="STHeiti" w:hAnsi="STHeiti" w:eastAsia="STHeiti"/>
+          <w:color w:val="263646"/>
+          <w:sz w:val="21"/>
+        </w:rPr>
+        <w:t>建议按“服务健康、业务连续性、资源容量、链路定位”四层建设统一可观测指标：</w:t>
+      </w:r>
+    </w:p>
+    <w:tbl>
+      <w:tblPr>
+        <w:tblStyle w:val="TableGrid"/>
+        <w:tblW w:type="auto" w:w="0"/>
+        <w:jc w:val="center"/>
+        <w:tblLayout w:type="autofit"/>
+        <w:tblLook w:firstColumn="1" w:firstRow="1" w:lastColumn="0" w:lastRow="0" w:noHBand="0" w:noVBand="1" w:val="04A0"/>
+      </w:tblPr>
+      <w:tblGrid>
+        <w:gridCol w:w="3099"/>
+        <w:gridCol w:w="3099"/>
+        <w:gridCol w:w="3099"/>
+      </w:tblGrid>
+      <w:tr>
+        <w:trPr>
+          <w:tblHeader w:val="true"/>
+        </w:trPr>
+        <w:tc>
+          <w:tcPr>
+            <w:tcW w:type="dxa" w:w="3099"/>
+            <w:vAlign w:val="center"/>
+            <w:shd w:fill="12365A"/>
+          </w:tcPr>
+          <w:p>
+            <w:r>
+              <w:rPr>
+                <w:rFonts w:ascii="STHeiti" w:hAnsi="STHeiti" w:eastAsia="STHeiti"/>
+                <w:b/>
+                <w:color w:val="FFFFFF"/>
+                <w:sz w:val="18"/>
+              </w:rPr>
+              <w:t>指标层级</w:t>
+            </w:r>
+          </w:p>
+        </w:tc>
+        <w:tc>
+          <w:tcPr>
+            <w:tcW w:type="dxa" w:w="3099"/>
+            <w:vAlign w:val="center"/>
+            <w:shd w:fill="12365A"/>
+          </w:tcPr>
+          <w:p>
+            <w:r>
+              <w:rPr>
+                <w:rFonts w:ascii="STHeiti" w:hAnsi="STHeiti" w:eastAsia="STHeiti"/>
+                <w:b/>
+                <w:color w:val="FFFFFF"/>
+                <w:sz w:val="18"/>
+              </w:rPr>
+              <w:t>重点指标</w:t>
+            </w:r>
+          </w:p>
+        </w:tc>
+        <w:tc>
+          <w:tcPr>
+            <w:tcW w:type="dxa" w:w="3099"/>
+            <w:vAlign w:val="center"/>
+            <w:shd w:fill="12365A"/>
+          </w:tcPr>
+          <w:p>
+            <w:r>
+              <w:rPr>
+                <w:rFonts w:ascii="STHeiti" w:hAnsi="STHeiti" w:eastAsia="STHeiti"/>
+                <w:b/>
+                <w:color w:val="FFFFFF"/>
+                <w:sz w:val="18"/>
+              </w:rPr>
+              <w:t>用途</w:t>
+            </w:r>
+          </w:p>
+        </w:tc>
+      </w:tr>
+      <w:tr>
+        <w:tc>
+          <w:tcPr>
+            <w:tcW w:type="dxa" w:w="3099"/>
+            <w:vAlign w:val="center"/>
+          </w:tcPr>
+          <w:p>
+            <w:r>
+              <w:rPr>
+                <w:rFonts w:ascii="STHeiti" w:hAnsi="STHeiti" w:eastAsia="STHeiti"/>
+                <w:color w:val="263646"/>
+                <w:sz w:val="18"/>
+              </w:rPr>
+              <w:t>服务黄金指标</w:t>
+            </w:r>
+          </w:p>
+        </w:tc>
+        <w:tc>
+          <w:tcPr>
+            <w:tcW w:type="dxa" w:w="3099"/>
+            <w:vAlign w:val="center"/>
+          </w:tcPr>
+          <w:p>
+            <w:r>
+              <w:rPr>
+                <w:rFonts w:ascii="STHeiti" w:hAnsi="STHeiti" w:eastAsia="STHeiti"/>
+                <w:color w:val="263646"/>
+                <w:sz w:val="18"/>
+              </w:rPr>
+              <w:t>HTTP 请求量、成功率、错误率、P95/P99 延迟、超时数、限流数</w:t>
+            </w:r>
+          </w:p>
+        </w:tc>
+        <w:tc>
+          <w:tcPr>
+            <w:tcW w:type="dxa" w:w="3099"/>
+            <w:vAlign w:val="center"/>
+          </w:tcPr>
+          <w:p>
+            <w:r>
+              <w:rPr>
+                <w:rFonts w:ascii="STHeiti" w:hAnsi="STHeiti" w:eastAsia="STHeiti"/>
+                <w:color w:val="263646"/>
+                <w:sz w:val="18"/>
+              </w:rPr>
+              <w:t>判断单个服务是否稳定，对发布回归和容量告警最直接</w:t>
+            </w:r>
+          </w:p>
+        </w:tc>
+      </w:tr>
+      <w:tr>
+        <w:tc>
+          <w:tcPr>
+            <w:tcW w:type="dxa" w:w="3099"/>
+            <w:vAlign w:val="center"/>
+            <w:shd w:fill="F4F7FA"/>
+          </w:tcPr>
+          <w:p>
+            <w:r>
+              <w:rPr>
+                <w:rFonts w:ascii="STHeiti" w:hAnsi="STHeiti" w:eastAsia="STHeiti"/>
+                <w:color w:val="263646"/>
+                <w:sz w:val="18"/>
+              </w:rPr>
+              <w:t>认证与权限</w:t>
+            </w:r>
+          </w:p>
+        </w:tc>
+        <w:tc>
+          <w:tcPr>
+            <w:tcW w:type="dxa" w:w="3099"/>
+            <w:vAlign w:val="center"/>
+            <w:shd w:fill="F4F7FA"/>
+          </w:tcPr>
+          <w:p>
+            <w:r>
+              <w:rPr>
+                <w:rFonts w:ascii="STHeiti" w:hAnsi="STHeiti" w:eastAsia="STHeiti"/>
+                <w:color w:val="263646"/>
+                <w:sz w:val="18"/>
+              </w:rPr>
+              <w:t>Auth 登录成功率、失败原因、会话数、鉴权延迟、越权拦截次数</w:t>
+            </w:r>
+          </w:p>
+        </w:tc>
+        <w:tc>
+          <w:tcPr>
+            <w:tcW w:type="dxa" w:w="3099"/>
+            <w:vAlign w:val="center"/>
+            <w:shd w:fill="F4F7FA"/>
+          </w:tcPr>
+          <w:p>
+            <w:r>
+              <w:rPr>
+                <w:rFonts w:ascii="STHeiti" w:hAnsi="STHeiti" w:eastAsia="STHeiti"/>
+                <w:color w:val="263646"/>
+                <w:sz w:val="18"/>
+              </w:rPr>
+              <w:t>识别登录异常、权限配置错误和认证中心性能瓶颈</w:t>
+            </w:r>
+          </w:p>
+        </w:tc>
+      </w:tr>
+      <w:tr>
+        <w:tc>
+          <w:tcPr>
+            <w:tcW w:type="dxa" w:w="3099"/>
+            <w:vAlign w:val="center"/>
+          </w:tcPr>
+          <w:p>
+            <w:r>
+              <w:rPr>
+                <w:rFonts w:ascii="STHeiti" w:hAnsi="STHeiti" w:eastAsia="STHeiti"/>
+                <w:color w:val="263646"/>
+                <w:sz w:val="18"/>
+              </w:rPr>
+              <w:t>数据与存储</w:t>
+            </w:r>
+          </w:p>
+        </w:tc>
+        <w:tc>
+          <w:tcPr>
+            <w:tcW w:type="dxa" w:w="3099"/>
+            <w:vAlign w:val="center"/>
+          </w:tcPr>
+          <w:p>
+            <w:r>
+              <w:rPr>
+                <w:rFonts w:ascii="STHeiti" w:hAnsi="STHeiti" w:eastAsia="STHeiti"/>
+                <w:color w:val="263646"/>
+                <w:sz w:val="18"/>
+              </w:rPr>
+              <w:t>数据库连接池使用率、慢查询、容量、备份状态、文件卷容量、增长率、孤儿文件数量</w:t>
+            </w:r>
+          </w:p>
+        </w:tc>
+        <w:tc>
+          <w:tcPr>
+            <w:tcW w:type="dxa" w:w="3099"/>
+            <w:vAlign w:val="center"/>
+          </w:tcPr>
+          <w:p>
+            <w:r>
+              <w:rPr>
+                <w:rFonts w:ascii="STHeiti" w:hAnsi="STHeiti" w:eastAsia="STHeiti"/>
+                <w:color w:val="263646"/>
+                <w:sz w:val="18"/>
+              </w:rPr>
+              <w:t>提前发现容量风险、备份缺口和数据访问性能问题</w:t>
+            </w:r>
+          </w:p>
+        </w:tc>
+      </w:tr>
+      <w:tr>
+        <w:tc>
+          <w:tcPr>
+            <w:tcW w:type="dxa" w:w="3099"/>
+            <w:vAlign w:val="center"/>
+            <w:shd w:fill="F4F7FA"/>
+          </w:tcPr>
+          <w:p>
+            <w:r>
+              <w:rPr>
+                <w:rFonts w:ascii="STHeiti" w:hAnsi="STHeiti" w:eastAsia="STHeiti"/>
+                <w:color w:val="263646"/>
+                <w:sz w:val="18"/>
+              </w:rPr>
+              <w:t>异步任务</w:t>
+            </w:r>
+          </w:p>
+        </w:tc>
+        <w:tc>
+          <w:tcPr>
+            <w:tcW w:type="dxa" w:w="3099"/>
+            <w:vAlign w:val="center"/>
+            <w:shd w:fill="F4F7FA"/>
+          </w:tcPr>
+          <w:p>
+            <w:r>
+              <w:rPr>
+                <w:rFonts w:ascii="STHeiti" w:hAnsi="STHeiti" w:eastAsia="STHeiti"/>
+                <w:color w:val="263646"/>
+                <w:sz w:val="18"/>
+              </w:rPr>
+              <w:t>Worker 队列长度、任务耗时、失败率、重试次数、死信数量</w:t>
+            </w:r>
+          </w:p>
+        </w:tc>
+        <w:tc>
+          <w:tcPr>
+            <w:tcW w:type="dxa" w:w="3099"/>
+            <w:vAlign w:val="center"/>
+            <w:shd w:fill="F4F7FA"/>
+          </w:tcPr>
+          <w:p>
+            <w:r>
+              <w:rPr>
+                <w:rFonts w:ascii="STHeiti" w:hAnsi="STHeiti" w:eastAsia="STHeiti"/>
+                <w:color w:val="263646"/>
+                <w:sz w:val="18"/>
+              </w:rPr>
+              <w:t>发现 SCA 扫描、报告生成、外部同步等后台任务积压</w:t>
+            </w:r>
+          </w:p>
+        </w:tc>
+      </w:tr>
+      <w:tr>
+        <w:tc>
+          <w:tcPr>
+            <w:tcW w:type="dxa" w:w="3099"/>
+            <w:vAlign w:val="center"/>
+          </w:tcPr>
+          <w:p>
+            <w:r>
+              <w:rPr>
+                <w:rFonts w:ascii="STHeiti" w:hAnsi="STHeiti" w:eastAsia="STHeiti"/>
+                <w:color w:val="263646"/>
+                <w:sz w:val="18"/>
+              </w:rPr>
+              <w:t>外部依赖</w:t>
+            </w:r>
+          </w:p>
+        </w:tc>
+        <w:tc>
+          <w:tcPr>
+            <w:tcW w:type="dxa" w:w="3099"/>
+            <w:vAlign w:val="center"/>
+          </w:tcPr>
+          <w:p>
+            <w:r>
+              <w:rPr>
+                <w:rFonts w:ascii="STHeiti" w:hAnsi="STHeiti" w:eastAsia="STHeiti"/>
+                <w:color w:val="263646"/>
+                <w:sz w:val="18"/>
+              </w:rPr>
+              <w:t>第三方服务成功率、超时率、熔断状态、降级次数、最近恢复时间</w:t>
+            </w:r>
+          </w:p>
+        </w:tc>
+        <w:tc>
+          <w:tcPr>
+            <w:tcW w:type="dxa" w:w="3099"/>
+            <w:vAlign w:val="center"/>
+          </w:tcPr>
+          <w:p>
+            <w:r>
+              <w:rPr>
+                <w:rFonts w:ascii="STHeiti" w:hAnsi="STHeiti" w:eastAsia="STHeiti"/>
+                <w:color w:val="263646"/>
+                <w:sz w:val="18"/>
+              </w:rPr>
+              <w:t>评估物流、漏洞源、AI、OCR、对象存储等依赖对业务的影响</w:t>
+            </w:r>
+          </w:p>
+        </w:tc>
+      </w:tr>
+      <w:tr>
+        <w:tc>
+          <w:tcPr>
+            <w:tcW w:type="dxa" w:w="3099"/>
+            <w:vAlign w:val="center"/>
+            <w:shd w:fill="F4F7FA"/>
+          </w:tcPr>
+          <w:p>
+            <w:r>
+              <w:rPr>
+                <w:rFonts w:ascii="STHeiti" w:hAnsi="STHeiti" w:eastAsia="STHeiti"/>
+                <w:color w:val="263646"/>
+                <w:sz w:val="18"/>
+              </w:rPr>
+              <w:t>安全运营</w:t>
+            </w:r>
+          </w:p>
+        </w:tc>
+        <w:tc>
+          <w:tcPr>
+            <w:tcW w:type="dxa" w:w="3099"/>
+            <w:vAlign w:val="center"/>
+            <w:shd w:fill="F4F7FA"/>
+          </w:tcPr>
+          <w:p>
+            <w:r>
+              <w:rPr>
+                <w:rFonts w:ascii="STHeiti" w:hAnsi="STHeiti" w:eastAsia="STHeiti"/>
+                <w:color w:val="263646"/>
+                <w:sz w:val="18"/>
+              </w:rPr>
+              <w:t>登录失败、鉴权失败、敏感配置变更、审计签名异常、SCA 高危新增数</w:t>
+            </w:r>
+          </w:p>
+        </w:tc>
+        <w:tc>
+          <w:tcPr>
+            <w:tcW w:type="dxa" w:w="3099"/>
+            <w:vAlign w:val="center"/>
+            <w:shd w:fill="F4F7FA"/>
+          </w:tcPr>
+          <w:p>
+            <w:r>
+              <w:rPr>
+                <w:rFonts w:ascii="STHeiti" w:hAnsi="STHeiti" w:eastAsia="STHeiti"/>
+                <w:color w:val="263646"/>
+                <w:sz w:val="18"/>
+              </w:rPr>
+              <w:t>支撑 OWASP A09 安全日志与告警治理</w:t>
+            </w:r>
+          </w:p>
+        </w:tc>
+      </w:tr>
+    </w:tbl>
+    <w:p/>
+    <w:p>
+      <w:r>
+        <w:rPr>
+          <w:rFonts w:ascii="STHeiti" w:hAnsi="STHeiti" w:eastAsia="STHeiti"/>
+          <w:color w:val="263646"/>
+          <w:sz w:val="21"/>
+        </w:rPr>
+        <w:t xml:space="preserve">后续应统一引入结构化日志、指标采集和分布式追踪。所有入口请求生成或继承 </w:t>
       </w:r>
       <w:r>
         <w:rPr>
@@ -13040,7 +13349,7 @@
           <w:color w:val="263646"/>
           <w:sz w:val="21"/>
         </w:rPr>
-        <w:t>。</w:t>
+        <w:t>，并在网关、Auth、业务 API、Worker、数据库访问、外部依赖调用和审计记录中贯穿，做到一次异常可以从日志、指标、链路和审计四个视角定位。</w:t>
       </w:r>
     </w:p>
     <w:p>

</xml_diff>

<commit_message>
[v5.74.0] feat(observability): add baseline metrics and request tracing
</commit_message>
<xml_diff>
--- a/outputs/all-systems-hld/聚信多系统业务平台高层设计.docx
+++ b/outputs/all-systems-hld/聚信多系统业务平台高层设计.docx
@@ -11014,6 +11014,22 @@
           <w:color w:val="263646"/>
           <w:sz w:val="21"/>
         </w:rPr>
+        <w:t>、</w:t>
+      </w:r>
+      <w:r>
+        <w:rPr>
+          <w:rFonts w:ascii="Courier New" w:hAnsi="Courier New" w:eastAsia="Courier New"/>
+          <w:color w:val="12365A"/>
+          <w:sz w:val="20"/>
+        </w:rPr>
+        <w:t>/api/metrics</w:t>
+      </w:r>
+      <w:r>
+        <w:rPr>
+          <w:rFonts w:ascii="STHeiti" w:hAnsi="STHeiti" w:eastAsia="STHeiti"/>
+          <w:color w:val="263646"/>
+          <w:sz w:val="21"/>
+        </w:rPr>
         <w:t>，发布验证脚本应按系统清单逐项检查。</w:t>
       </w:r>
     </w:p>
@@ -11457,7 +11473,7 @@
           <w:color w:val="263646"/>
           <w:sz w:val="21"/>
         </w:rPr>
-        <w:t>SCA 已对 PostgreSQL 和 Redis 配置 Compose 健康检查；其他业务的依赖启动条件并不完全等价于业务就绪，运维脚本必须执行统一的应用级健康、就绪、版本和构建信息接口验证。</w:t>
+        <w:t>SCA 已对 PostgreSQL 和 Redis 配置 Compose 健康检查；其他业务的依赖启动条件并不完全等价于业务就绪，运维脚本必须执行统一的应用级健康、就绪、版本、构建信息和指标接口验证。</w:t>
       </w:r>
     </w:p>
     <w:p>
@@ -12866,6 +12882,22 @@
           <w:color w:val="263646"/>
           <w:sz w:val="21"/>
         </w:rPr>
+        <w:t>、</w:t>
+      </w:r>
+      <w:r>
+        <w:rPr>
+          <w:rFonts w:ascii="Courier New" w:hAnsi="Courier New" w:eastAsia="Courier New"/>
+          <w:color w:val="12365A"/>
+          <w:sz w:val="20"/>
+        </w:rPr>
+        <w:t>/api/metrics</w:t>
+      </w:r>
+      <w:r>
+        <w:rPr>
+          <w:rFonts w:ascii="STHeiti" w:hAnsi="STHeiti" w:eastAsia="STHeiti"/>
+          <w:color w:val="263646"/>
+          <w:sz w:val="21"/>
+        </w:rPr>
         <w:t>。</w:t>
       </w:r>
     </w:p>
@@ -12880,7 +12912,55 @@
           <w:color w:val="263646"/>
           <w:sz w:val="21"/>
         </w:rPr>
-        <w:t>Docker Compose 容器状态与日志。</w:t>
+        <w:t xml:space="preserve">11 个现役业务后端统一生成或继承 </w:t>
+      </w:r>
+      <w:r>
+        <w:rPr>
+          <w:rFonts w:ascii="Courier New" w:hAnsi="Courier New" w:eastAsia="Courier New"/>
+          <w:color w:val="12365A"/>
+          <w:sz w:val="20"/>
+        </w:rPr>
+        <w:t>X-Request-Id</w:t>
+      </w:r>
+      <w:r>
+        <w:rPr>
+          <w:rFonts w:ascii="STHeiti" w:hAnsi="STHeiti" w:eastAsia="STHeiti"/>
+          <w:color w:val="263646"/>
+          <w:sz w:val="21"/>
+        </w:rPr>
+        <w:t xml:space="preserve">，并在结构化访问日志中输出 </w:t>
+      </w:r>
+      <w:r>
+        <w:rPr>
+          <w:rFonts w:ascii="Courier New" w:hAnsi="Courier New" w:eastAsia="Courier New"/>
+          <w:color w:val="12365A"/>
+          <w:sz w:val="20"/>
+        </w:rPr>
+        <w:t>request_id</w:t>
+      </w:r>
+      <w:r>
+        <w:rPr>
+          <w:rFonts w:ascii="STHeiti" w:hAnsi="STHeiti" w:eastAsia="STHeiti"/>
+          <w:color w:val="263646"/>
+          <w:sz w:val="21"/>
+        </w:rPr>
+        <w:t xml:space="preserve">、路径、状态码和 </w:t>
+      </w:r>
+      <w:r>
+        <w:rPr>
+          <w:rFonts w:ascii="Courier New" w:hAnsi="Courier New" w:eastAsia="Courier New"/>
+          <w:color w:val="12365A"/>
+          <w:sz w:val="20"/>
+        </w:rPr>
+        <w:t>duration_ms</w:t>
+      </w:r>
+      <w:r>
+        <w:rPr>
+          <w:rFonts w:ascii="STHeiti" w:hAnsi="STHeiti" w:eastAsia="STHeiti"/>
+          <w:color w:val="263646"/>
+          <w:sz w:val="21"/>
+        </w:rPr>
+        <w:t>。</w:t>
       </w:r>
     </w:p>
     <w:p>
@@ -12894,7 +12974,7 @@
           <w:color w:val="263646"/>
           <w:sz w:val="21"/>
         </w:rPr>
-        <w:t>业务操作日志和统一审计中心。</w:t>
+        <w:t>Docker Compose 容器状态与结构化日志。</w:t>
       </w:r>
     </w:p>
     <w:p>
@@ -12908,7 +12988,7 @@
           <w:color w:val="263646"/>
           <w:sz w:val="21"/>
         </w:rPr>
-        <w:t>SCA 任务、扫描和持续风险监测记录。</w:t>
+        <w:t>业务操作日志和统一审计中心。</w:t>
       </w:r>
     </w:p>
     <w:p>
@@ -12922,6 +13002,20 @@
           <w:color w:val="263646"/>
           <w:sz w:val="21"/>
         </w:rPr>
+        <w:t>SCA 任务、扫描和持续风险监测记录。</w:t>
+      </w:r>
+    </w:p>
+    <w:p>
+      <w:pPr>
+        <w:pStyle w:val="ListBullet"/>
+        <w:ind w:left="397"/>
+      </w:pPr>
+      <w:r>
+        <w:rPr>
+          <w:rFonts w:ascii="STHeiti" w:hAnsi="STHeiti" w:eastAsia="STHeiti"/>
+          <w:color w:val="263646"/>
+          <w:sz w:val="21"/>
+        </w:rPr>
         <w:t>Big Screen 来源健康接口。</w:t>
       </w:r>
     </w:p>
@@ -12930,17 +13024,17 @@
         <w:pStyle w:val="Heading3"/>
       </w:pPr>
       <w:r>
-        <w:t>12.2 建议统一指标</w:t>
-      </w:r>
-    </w:p>
-    <w:p>
-      <w:r>
-        <w:rPr>
-          <w:rFonts w:ascii="STHeiti" w:hAnsi="STHeiti" w:eastAsia="STHeiti"/>
-          <w:color w:val="263646"/>
-          <w:sz w:val="21"/>
-        </w:rPr>
-        <w:t>建议按“服务健康、业务连续性、资源容量、链路定位”四层建设统一可观测指标：</w:t>
+        <w:t>12.2 统一指标基线</w:t>
+      </w:r>
+    </w:p>
+    <w:p>
+      <w:r>
+        <w:rPr>
+          <w:rFonts w:ascii="STHeiti" w:hAnsi="STHeiti" w:eastAsia="STHeiti"/>
+          <w:color w:val="263646"/>
+          <w:sz w:val="21"/>
+        </w:rPr>
+        <w:t>当前已按“服务健康、业务连续性、资源容量、链路定位”四层落地基础可观测口径：</w:t>
       </w:r>
     </w:p>
     <w:tbl>
@@ -13044,7 +13138,7 @@
                 <w:color w:val="263646"/>
                 <w:sz w:val="18"/>
               </w:rPr>
-              <w:t>HTTP 请求量、成功率、错误率、P95/P99 延迟、超时数、限流数</w:t>
+              <w:t>HTTP 请求量、错误数、并发数、平均耗时、最大耗时、状态码分布</w:t>
             </w:r>
           </w:p>
         </w:tc>
@@ -13060,7 +13154,23 @@
                 <w:color w:val="263646"/>
                 <w:sz w:val="18"/>
               </w:rPr>
-              <w:t>判断单个服务是否稳定，对发布回归和容量告警最直接</w:t>
+              <w:t xml:space="preserve">已由各业务后端 </w:t>
+            </w:r>
+            <w:r>
+              <w:rPr>
+                <w:rFonts w:ascii="Courier New" w:hAnsi="Courier New" w:eastAsia="Courier New"/>
+                <w:color w:val="12365A"/>
+                <w:sz w:val="17"/>
+              </w:rPr>
+              <w:t>/api/metrics</w:t>
+            </w:r>
+            <w:r>
+              <w:rPr>
+                <w:rFonts w:ascii="STHeiti" w:hAnsi="STHeiti" w:eastAsia="STHeiti"/>
+                <w:color w:val="263646"/>
+                <w:sz w:val="18"/>
+              </w:rPr>
+              <w:t xml:space="preserve"> 提供进程级快照，用于发布回归和容量告警</w:t>
             </w:r>
           </w:p>
         </w:tc>
@@ -13333,7 +13443,7 @@
           <w:color w:val="263646"/>
           <w:sz w:val="21"/>
         </w:rPr>
-        <w:t xml:space="preserve">后续应统一引入结构化日志、指标采集和分布式追踪。所有入口请求生成或继承 </w:t>
+        <w:t xml:space="preserve">当前已完成各业务 API 的结构化访问日志和 </w:t>
       </w:r>
       <w:r>
         <w:rPr>
@@ -13349,7 +13459,7 @@
           <w:color w:val="263646"/>
           <w:sz w:val="21"/>
         </w:rPr>
-        <w:t>，并在网关、Auth、业务 API、Worker、数据库访问、外部依赖调用和审计记录中贯穿，做到一次异常可以从日志、指标、链路和审计四个视角定位。</w:t>
+        <w:t xml:space="preserve"> 贯穿基础能力。后续应接入统一日志平台、指标采集器和分布式追踪，把网关、Auth、业务 API、Worker、数据库访问、外部依赖调用和审计记录串成完整链路，做到一次异常可以从日志、指标、链路和审计四个视角定位。</w:t>
       </w:r>
     </w:p>
     <w:p>
@@ -14219,7 +14329,37 @@
           <w:color w:val="263646"/>
           <w:sz w:val="21"/>
         </w:rPr>
-        <w:t>已统一健康、就绪、版本和构建信息接口。</w:t>
+        <w:t>已统一健康、就绪、版本、构建信息和基础指标接口。</w:t>
+      </w:r>
+    </w:p>
+    <w:p>
+      <w:pPr>
+        <w:pStyle w:val="ListBullet"/>
+        <w:ind w:left="397"/>
+      </w:pPr>
+      <w:r>
+        <w:rPr>
+          <w:rFonts w:ascii="STHeiti" w:hAnsi="STHeiti" w:eastAsia="STHeiti"/>
+          <w:color w:val="263646"/>
+          <w:sz w:val="21"/>
+        </w:rPr>
+        <w:t xml:space="preserve">已统一 11 个现役业务后端的 </w:t>
+      </w:r>
+      <w:r>
+        <w:rPr>
+          <w:rFonts w:ascii="Courier New" w:hAnsi="Courier New" w:eastAsia="Courier New"/>
+          <w:color w:val="12365A"/>
+          <w:sz w:val="20"/>
+        </w:rPr>
+        <w:t>X-Request-Id</w:t>
+      </w:r>
+      <w:r>
+        <w:rPr>
+          <w:rFonts w:ascii="STHeiti" w:hAnsi="STHeiti" w:eastAsia="STHeiti"/>
+          <w:color w:val="263646"/>
+          <w:sz w:val="21"/>
+        </w:rPr>
+        <w:t xml:space="preserve"> 和结构化访问日志。</w:t>
       </w:r>
     </w:p>
     <w:p>

</xml_diff>